<commit_message>
site: unify Data + Stack across 5 canonical resumes (DOCX + PDF)
Consolidates the Technical block across all 5 canonical resumes:

- Data row absorbs Etherscan, rated.network, Beaconcha.in, FRED, Tally previously enumerated only in Stack's MCP-server list.
- Stack row collapses the MCP-server enumeration to "14 custom Python MCP servers wrapping the data sources above plus GitHub"; preserves R toolkit and Claude.ai + 36-skill + 17-file living-knowledge phrasing.
- AI Governance variant's Stack override removed; all 5 variants now use the shared TECH_DEFAULT.

Matches workflow-clone commit e2d44692 (CryptoZach/Claude1).

Co-Authored-By: Claude Opus 4.7 (1M context) <noreply@anthropic.com>
</commit_message>
<xml_diff>
--- a/resumes/Zukowski_Resume_AI_Governance_Infrastructure.docx
+++ b/resumes/Zukowski_Resume_AI_Governance_Infrastructure.docx
@@ -120,7 +120,7 @@
           <w:sz w:val="18"/>
           <w:szCs w:val="19"/>
         </w:rPr>
-        <w:t>14 custom MCP servers · ~75 DATs analyzed · diligence⁠-⁠doc review shortened from 4hr to 1hr per deal · 8 SSRN papers · 8 federal comment letters</w:t>
+        <w:t>14 custom MCP servers · ~75 DATs analyzed · diligence⁠-⁠doc review shortened from 4hr to 1hr per deal · 8 SSRN papers</w:t>
       </w:r>
     </w:p>
     <w:p>
@@ -737,7 +737,7 @@
         <w:t>Data:</w:t>
       </w:r>
       <w:r>
-        <w:t xml:space="preserve"> Dune Analytics, Nansen Pro, Artemis, DefiLlama, CoinGecko, Helius (Solana), Spacescope, Blockscout, Token Terminal; automated SEC filing and press release monitoring + data extraction</w:t>
+        <w:t xml:space="preserve"> Dune Analytics, Nansen Pro, Artemis, DefiLlama, CoinGecko, Helius (Solana), Etherscan, Blockscout (EVM), Spacescope, Token Terminal, Tally (DAO governance), rated.network, Beaconcha.in (validator data), FRED (macro); automated SEC filing and press release monitoring</w:t>
       </w:r>
     </w:p>
     <w:p>
@@ -751,7 +751,7 @@
         <w:t>Stack:</w:t>
       </w:r>
       <w:r>
-        <w:t xml:space="preserve"> 14 custom Python MCP servers spanning FRED (macro data), DefiLlama / CoinGecko / Artemis (stablecoin and DeFi), Helius (Solana), Etherscan / Blockscout (EVM chains), rated.network / Beaconcha.in (validator data), Tally (DAO governance), Dune Analytics, Spacescope, Nansen (wallet flows), GitHub (specs and code); Python (pandas, statsmodels, scipy, matplotlib), SQL (DuneSQL, Trino), JavaScript / TypeScript; Claude Code, Cursor, n8n, Apify, Git / GitHub</w:t>
+        <w:t xml:space="preserve"> Python (pandas, statsmodels, scipy, matplotlib), R (fixest, did, synthdid), SQL (DuneSQL, Trino), JavaScript / TypeScript; 14 custom Python MCP servers wrapping the data sources above plus GitHub; Claude.ai + Claude Code + Cursor with 36-skill library and 17-file living-knowledge architecture; n8n, Apify, Git / GitHub</w:t>
       </w:r>
     </w:p>
     <w:p>

</xml_diff>

<commit_message>
site: hyperlink research-program bullet to /papers/ pages in 5 canonical resumes (DOCX + PDF)
Five framework/paper terms in the research-program bullet now hyperlink to tokenization.systems/papers/ pages:

- Control Layer Intensity Index → /papers/control-layer-war/
- Minimum Viable Equivalence Pack → /papers/mvep/
- Adaptive Tokenomics → /papers/adaptive-tokenomics/ (preserved from prior)
- governance concentration → /papers/governance-concentration/
- operational risk in token economies → /papers/operational-risk/

Matches workflow-clone commit c925b7d5 (CryptoZach/Claude1).

Co-Authored-By: Claude Opus 4.7 (1M context) <noreply@anthropic.com>
</commit_message>
<xml_diff>
--- a/resumes/Zukowski_Resume_AI_Governance_Infrastructure.docx
+++ b/resumes/Zukowski_Resume_AI_Governance_Infrastructure.docx
@@ -209,25 +209,31 @@
       <w:r>
         <w:t xml:space="preserve">• Authored an eight-paper SSRN-live research program covering the </w:t>
       </w:r>
-      <w:r>
-        <w:rPr>
-          <w:b/>
-        </w:rPr>
-        <w:t>Control Layer Intensity Index</w:t>
-      </w:r>
+      <w:hyperlink r:id="rId6">
+        <w:r>
+          <w:rPr>
+            <w:rStyle w:val="Hyperlink"/>
+            <w:b/>
+          </w:rPr>
+          <w:t xml:space="preserve">Control Layer Intensity Index</w:t>
+        </w:r>
+      </w:hyperlink>
       <w:r>
         <w:t xml:space="preserve"> (CLII) for gateway concentration, the </w:t>
       </w:r>
-      <w:r>
-        <w:rPr>
-          <w:b/>
-        </w:rPr>
-        <w:t>Minimum Viable Equivalence Pack</w:t>
-      </w:r>
+      <w:hyperlink r:id="rId7">
+        <w:r>
+          <w:rPr>
+            <w:rStyle w:val="Hyperlink"/>
+            <w:b/>
+          </w:rPr>
+          <w:t xml:space="preserve">Minimum Viable Equivalence Pack</w:t>
+        </w:r>
+      </w:hyperlink>
       <w:r>
         <w:t xml:space="preserve"> (MVEP) for institutional tokenization diligence, programmable monetary-policy design (</w:t>
       </w:r>
-      <w:hyperlink r:id="rId6">
+      <w:hyperlink r:id="rId8">
         <w:r>
           <w:rPr>
             <w:rStyle w:val="Hyperlink"/>
@@ -237,7 +243,29 @@
         </w:r>
       </w:hyperlink>
       <w:r>
-        <w:t>), governance concentration, and operational risk in token economies.</w:t>
+        <w:t xml:space="preserve">), </w:t>
+      </w:r>
+      <w:hyperlink r:id="rId10">
+        <w:r>
+          <w:rPr>
+            <w:rStyle w:val="Hyperlink"/>
+          </w:rPr>
+          <w:t xml:space="preserve">governance concentration</w:t>
+        </w:r>
+      </w:hyperlink>
+      <w:r>
+        <w:t xml:space="preserve">, and </w:t>
+      </w:r>
+      <w:hyperlink r:id="rId11">
+        <w:r>
+          <w:rPr>
+            <w:rStyle w:val="Hyperlink"/>
+          </w:rPr>
+          <w:t xml:space="preserve">operational risk in token economies</w:t>
+        </w:r>
+      </w:hyperlink>
+      <w:r>
+        <w:t>.</w:t>
       </w:r>
     </w:p>
     <w:p>
@@ -248,7 +276,7 @@
       <w:r>
         <w:t xml:space="preserve">• Contributed eight comment letters across a federal regulatory program (OCC bank stablecoin engagement </w:t>
       </w:r>
-      <w:hyperlink r:id="rId7">
+      <w:hyperlink r:id="rId12">
         <w:r>
           <w:rPr>
             <w:rStyle w:val="Hyperlink"/>
@@ -259,7 +287,7 @@
       <w:r>
         <w:t xml:space="preserve"> plus </w:t>
       </w:r>
-      <w:hyperlink r:id="rId8">
+      <w:hyperlink r:id="rId13">
         <w:r>
           <w:rPr>
             <w:rStyle w:val="Hyperlink"/>
@@ -270,84 +298,84 @@
       <w:r>
         <w:t xml:space="preserve">; </w:t>
       </w:r>
+      <w:hyperlink r:id="rId14">
+        <w:r>
+          <w:rPr>
+            <w:rStyle w:val="Hyperlink"/>
+          </w:rPr>
+          <w:t xml:space="preserve">Treasury GENIUS Act state similarity</w:t>
+        </w:r>
+      </w:hyperlink>
+      <w:r>
+        <w:t xml:space="preserve">; FDIC payment-stablecoin reserve standards </w:t>
+      </w:r>
+      <w:hyperlink r:id="rId15">
+        <w:r>
+          <w:rPr>
+            <w:rStyle w:val="Hyperlink"/>
+          </w:rPr>
+          <w:t xml:space="preserve">RIN 3064-AG19</w:t>
+        </w:r>
+      </w:hyperlink>
+      <w:r>
+        <w:t xml:space="preserve"> and stablecoin-subsidiary issuance approvals </w:t>
+      </w:r>
+      <w:hyperlink r:id="rId16">
+        <w:r>
+          <w:rPr>
+            <w:rStyle w:val="Hyperlink"/>
+          </w:rPr>
+          <w:t xml:space="preserve">RIN 3064-AG20</w:t>
+        </w:r>
+      </w:hyperlink>
+      <w:r>
+        <w:t xml:space="preserve">; FinCEN AML/CFT </w:t>
+      </w:r>
+      <w:hyperlink r:id="rId17">
+        <w:r>
+          <w:rPr>
+            <w:rStyle w:val="Hyperlink"/>
+          </w:rPr>
+          <w:t xml:space="preserve">FINCEN-2026-0034</w:t>
+        </w:r>
+      </w:hyperlink>
+      <w:r>
+        <w:t xml:space="preserve">; FinCEN-OFAC PPSI sanctions </w:t>
+      </w:r>
+      <w:hyperlink r:id="rId18">
+        <w:r>
+          <w:rPr>
+            <w:rStyle w:val="Hyperlink"/>
+          </w:rPr>
+          <w:t xml:space="preserve">FINCEN-2026-0100</w:t>
+        </w:r>
+      </w:hyperlink>
+      <w:r>
+        <w:t xml:space="preserve">; joint banking AML/CFT </w:t>
+      </w:r>
+      <w:hyperlink r:id="rId19">
+        <w:r>
+          <w:rPr>
+            <w:rStyle w:val="Hyperlink"/>
+          </w:rPr>
+          <w:t xml:space="preserve">91 FR 18304</w:t>
+        </w:r>
+      </w:hyperlink>
+      <w:r>
+        <w:t xml:space="preserve">); </w:t>
+      </w:r>
+      <w:hyperlink r:id="rId20">
+        <w:r>
+          <w:rPr>
+            <w:rStyle w:val="Hyperlink"/>
+          </w:rPr>
+          <w:t xml:space="preserve">Routing the Dollar</w:t>
+        </w:r>
+      </w:hyperlink>
+      <w:r>
+        <w:t xml:space="preserve"> submitted to the Federal Reserve Fifth Conference on the Dollar's International Roles (Jun 2026); </w:t>
+      </w:r>
       <w:hyperlink r:id="rId10">
-        <w:r>
-          <w:rPr>
-            <w:rStyle w:val="Hyperlink"/>
-          </w:rPr>
-          <w:t xml:space="preserve">Treasury GENIUS Act state similarity</w:t>
-        </w:r>
-      </w:hyperlink>
-      <w:r>
-        <w:t xml:space="preserve">; FDIC payment-stablecoin reserve standards </w:t>
-      </w:r>
-      <w:hyperlink r:id="rId11">
-        <w:r>
-          <w:rPr>
-            <w:rStyle w:val="Hyperlink"/>
-          </w:rPr>
-          <w:t xml:space="preserve">RIN 3064-AG19</w:t>
-        </w:r>
-      </w:hyperlink>
-      <w:r>
-        <w:t xml:space="preserve"> and stablecoin-subsidiary issuance approvals </w:t>
-      </w:r>
-      <w:hyperlink r:id="rId12">
-        <w:r>
-          <w:rPr>
-            <w:rStyle w:val="Hyperlink"/>
-          </w:rPr>
-          <w:t xml:space="preserve">RIN 3064-AG20</w:t>
-        </w:r>
-      </w:hyperlink>
-      <w:r>
-        <w:t xml:space="preserve">; FinCEN AML/CFT </w:t>
-      </w:r>
-      <w:hyperlink r:id="rId13">
-        <w:r>
-          <w:rPr>
-            <w:rStyle w:val="Hyperlink"/>
-          </w:rPr>
-          <w:t xml:space="preserve">FINCEN-2026-0034</w:t>
-        </w:r>
-      </w:hyperlink>
-      <w:r>
-        <w:t xml:space="preserve">; FinCEN-OFAC PPSI sanctions </w:t>
-      </w:r>
-      <w:hyperlink r:id="rId14">
-        <w:r>
-          <w:rPr>
-            <w:rStyle w:val="Hyperlink"/>
-          </w:rPr>
-          <w:t xml:space="preserve">FINCEN-2026-0100</w:t>
-        </w:r>
-      </w:hyperlink>
-      <w:r>
-        <w:t xml:space="preserve">; joint banking AML/CFT </w:t>
-      </w:r>
-      <w:hyperlink r:id="rId15">
-        <w:r>
-          <w:rPr>
-            <w:rStyle w:val="Hyperlink"/>
-          </w:rPr>
-          <w:t xml:space="preserve">91 FR 18304</w:t>
-        </w:r>
-      </w:hyperlink>
-      <w:r>
-        <w:t xml:space="preserve">); </w:t>
-      </w:r>
-      <w:hyperlink r:id="rId16">
-        <w:r>
-          <w:rPr>
-            <w:rStyle w:val="Hyperlink"/>
-          </w:rPr>
-          <w:t xml:space="preserve">Routing the Dollar</w:t>
-        </w:r>
-      </w:hyperlink>
-      <w:r>
-        <w:t xml:space="preserve"> submitted to the Federal Reserve Fifth Conference on the Dollar's International Roles (Jun 2026); </w:t>
-      </w:r>
-      <w:hyperlink r:id="rId17">
         <w:r>
           <w:rPr>
             <w:rStyle w:val="Hyperlink"/>
@@ -456,7 +484,7 @@
       <w:r>
         <w:t xml:space="preserve">• Advised 100 portfolio companies 1-on-1 on token mechanism design (stablecoin reserves, governance-token allocation and incentive design, yield wrappers, burn/emission dynamics); standards defined in </w:t>
       </w:r>
-      <w:hyperlink r:id="rId18">
+      <w:hyperlink r:id="rId21">
         <w:r>
           <w:rPr>
             <w:rStyle w:val="Hyperlink"/>
@@ -533,7 +561,7 @@
       <w:r>
         <w:t xml:space="preserve">• </w:t>
       </w:r>
-      <w:hyperlink r:id="rId17">
+      <w:hyperlink r:id="rId10">
         <w:r>
           <w:rPr>
             <w:rStyle w:val="Hyperlink"/>
@@ -554,7 +582,7 @@
       <w:r>
         <w:t xml:space="preserve">• </w:t>
       </w:r>
-      <w:hyperlink r:id="rId19">
+      <w:hyperlink r:id="rId11">
         <w:r>
           <w:rPr>
             <w:rStyle w:val="Hyperlink"/>
@@ -575,7 +603,7 @@
       <w:r>
         <w:t xml:space="preserve">• </w:t>
       </w:r>
-      <w:hyperlink r:id="rId6">
+      <w:hyperlink r:id="rId8">
         <w:r>
           <w:rPr>
             <w:rStyle w:val="Hyperlink"/>
@@ -596,17 +624,38 @@
       <w:r>
         <w:t xml:space="preserve">• </w:t>
       </w:r>
+      <w:hyperlink r:id="rId22">
+        <w:r>
+          <w:rPr>
+            <w:rStyle w:val="Hyperlink"/>
+            <w:b/>
+          </w:rPr>
+          <w:t xml:space="preserve">Who Burns the Tokens?</w:t>
+        </w:r>
+      </w:hyperlink>
+      <w:r>
+        <w:t xml:space="preserve"> Burn-mechanism design (carrier contracts vs. subscriptions) drives demand concentration: Helium's carrier-contract model concentrates ~90% of token burns in 5 purchasers (HHI 0.22) despite ~1M hotspots; coalition-power analysis extends standard concentration measures for single-address risk.</w:t>
+      </w:r>
+    </w:p>
+    <w:p>
+      <w:pPr>
+        <w:spacing w:after="28" w:before="60"/>
+        <w:ind w:left="320" w:hanging="160"/>
+      </w:pPr>
+      <w:r>
+        <w:t xml:space="preserve">• </w:t>
+      </w:r>
       <w:hyperlink r:id="rId20">
         <w:r>
           <w:rPr>
             <w:rStyle w:val="Hyperlink"/>
             <w:b/>
           </w:rPr>
-          <w:t xml:space="preserve">Who Burns the Tokens?</w:t>
-        </w:r>
-      </w:hyperlink>
-      <w:r>
-        <w:t xml:space="preserve"> Burn-mechanism design (carrier contracts vs. subscriptions) drives demand concentration: Helium's carrier-contract model concentrates ~90% of token burns in 5 purchasers (HHI 0.22) despite ~1M hotspots; coalition-power analysis extends standard concentration measures for single-address risk.</w:t>
+          <w:t xml:space="preserve">Routing the Dollar.</w:t>
+        </w:r>
+      </w:hyperlink>
+      <w:r>
+        <w:t xml:space="preserve"> Submitted to Federal Reserve / FRBNY Fifth Conference on the Dollar's International Roles (Jun 2026). Gateway concentration; CLII across 19 gateways including Visa Direct-adjacent paths.</w:t>
       </w:r>
     </w:p>
     <w:p>
@@ -617,17 +666,17 @@
       <w:r>
         <w:t xml:space="preserve">• </w:t>
       </w:r>
-      <w:hyperlink r:id="rId16">
+      <w:hyperlink r:id="rId7">
         <w:r>
           <w:rPr>
             <w:rStyle w:val="Hyperlink"/>
             <w:b/>
           </w:rPr>
-          <w:t xml:space="preserve">Routing the Dollar.</w:t>
-        </w:r>
-      </w:hyperlink>
-      <w:r>
-        <w:t xml:space="preserve"> Submitted to Federal Reserve / FRBNY Fifth Conference on the Dollar's International Roles (Jun 2026). Gateway concentration; CLII across 19 gateways including Visa Direct-adjacent paths.</w:t>
+          <w:t xml:space="preserve">Minimum Viable Equivalence Pack.</w:t>
+        </w:r>
+      </w:hyperlink>
+      <w:r>
+        <w:t xml:space="preserve"> Ten-category institutional diligence standard; finds bank-chartered stablecoin issuers face ~22x the regulatory capital requirements of money-transmitter-chartered issuers at $40B scale.</w:t>
       </w:r>
     </w:p>
     <w:p>
@@ -638,17 +687,17 @@
       <w:r>
         <w:t xml:space="preserve">• </w:t>
       </w:r>
-      <w:hyperlink r:id="rId21">
+      <w:hyperlink r:id="rId23">
         <w:r>
           <w:rPr>
             <w:rStyle w:val="Hyperlink"/>
             <w:b/>
           </w:rPr>
-          <w:t xml:space="preserve">Minimum Viable Equivalence Pack.</w:t>
-        </w:r>
-      </w:hyperlink>
-      <w:r>
-        <w:t xml:space="preserve"> Ten-category institutional diligence standard; finds bank-chartered stablecoin issuers face ~22x the regulatory capital requirements of money-transmitter-chartered issuers at $40B scale.</w:t>
+          <w:t xml:space="preserve">Three Tokenization Strategies.</w:t>
+        </w:r>
+      </w:hyperlink>
+      <w:r>
+        <w:t xml:space="preserve"> Each of three strategies satisfies different MVEP categories with measurably different strength (Regulated Collateral Circuit, Multi-Issuer Yield Stack, Tokenized Equity Rails); Securitize as cross-strategy concentration risk.</w:t>
       </w:r>
     </w:p>
     <w:p>
@@ -659,28 +708,7 @@
       <w:r>
         <w:t xml:space="preserve">• </w:t>
       </w:r>
-      <w:hyperlink r:id="rId22">
-        <w:r>
-          <w:rPr>
-            <w:rStyle w:val="Hyperlink"/>
-            <w:b/>
-          </w:rPr>
-          <w:t xml:space="preserve">Three Tokenization Strategies.</w:t>
-        </w:r>
-      </w:hyperlink>
-      <w:r>
-        <w:t xml:space="preserve"> Each of three strategies satisfies different MVEP categories with measurably different strength (Regulated Collateral Circuit, Multi-Issuer Yield Stack, Tokenized Equity Rails); Securitize as cross-strategy concentration risk.</w:t>
-      </w:r>
-    </w:p>
-    <w:p>
-      <w:pPr>
-        <w:spacing w:after="28" w:before="60"/>
-        <w:ind w:left="320" w:hanging="160"/>
-      </w:pPr>
-      <w:r>
-        <w:t xml:space="preserve">• </w:t>
-      </w:r>
-      <w:hyperlink r:id="rId23">
+      <w:hyperlink r:id="rId24">
         <w:r>
           <w:rPr>
             <w:rStyle w:val="Hyperlink"/>
@@ -799,7 +827,7 @@
       <w:r>
         <w:t xml:space="preserve">• </w:t>
       </w:r>
-      <w:hyperlink r:id="rId18">
+      <w:hyperlink r:id="rId21">
         <w:r>
           <w:rPr>
             <w:rStyle w:val="Hyperlink"/>

</xml_diff>

<commit_message>
resumes: title-led headlines + scannable summaries + 7pt proof-strip polish (6 variants)
Headlines lead with Founder, Tokenization Systems (AI on two lines); summaries are a
positioning line + Focus keyword line; proof strips at 7pt with no orphan bullets or
numbers. Patent re-attributed to USPTO 64/071,767 = Canonical-State Architecture (was
mislabeled cited-research system). 22 MCP + API connections; AI resume features the CSA
patent as its lead bullet.

Co-Authored-By: Claude Opus 4.8 (1M context) <noreply@anthropic.com>
</commit_message>
<xml_diff>
--- a/resumes/Zukowski_Resume_AI_Governance_Infrastructure.docx
+++ b/resumes/Zukowski_Resume_AI_Governance_Infrastructure.docx
@@ -105,7 +105,19 @@
           <w:sz w:val="23"/>
           <w:szCs w:val="23"/>
         </w:rPr>
-        <w:t>AI CONTROL-LAYER ACCOUNTABILITY · MACHINE-READABLE STABLECOIN CLASSIFICATION</w:t>
+        <w:t>FOUNDER, TOKENIZATION SYSTEMS · AI CONTROL⁠-⁠LAYER ACCOUNTABILITY</w:t>
+        <w:br/>
+      </w:r>
+      <w:r>
+        <w:rPr>
+          <w:rFonts w:ascii="Arial" w:cs="Arial" w:eastAsia="Arial" w:hAnsi="Arial"/>
+          <w:b/>
+          <w:bCs/>
+          <w:color w:val="1A1A1A"/>
+          <w:sz w:val="23"/>
+          <w:szCs w:val="23"/>
+        </w:rPr>
+        <w:t>· MACHINE⁠-⁠READABLE STABLECOIN CLASSIFICATION</w:t>
       </w:r>
     </w:p>
     <w:p>
@@ -117,10 +129,10 @@
         <w:rPr>
           <w:rFonts w:ascii="Arial" w:cs="Arial" w:eastAsia="Arial" w:hAnsi="Arial"/>
           <w:color w:val="444444"/>
-          <w:sz w:val="16"/>
+          <w:sz w:val="14"/>
           <w:szCs w:val="16"/>
         </w:rPr>
-        <w:t>14 custom MCP servers · ~75 DATs analyzed · diligence⁠-⁠doc review 4hr to 1hr · 8 SSRN papers · 8 federal comment letters · Patent-pending cited-research system architecture (USPTO 64/071,767)</w:t>
+        <w:t>· 22 MCP + API connections · ~75 DATs analyzed · Diligence⁠-⁠doc review 4hr to 1hr · 8 SSRN papers · 8 federal comment letters · Patent⁠-⁠pending Canonical⁠-⁠State Architecture for multi⁠-⁠agent AI research (USPTO 64/071,767)</w:t>
       </w:r>
     </w:p>
     <w:p>
@@ -144,7 +156,7 @@
     </w:p>
     <w:p>
       <w:pPr>
-        <w:spacing w:after="38" w:before="60"/>
+        <w:spacing w:after="40" w:before="60"/>
       </w:pPr>
       <w:r>
         <w:rPr>
@@ -153,7 +165,21 @@
           <w:sz w:val="19"/>
           <w:szCs w:val="16"/>
         </w:rPr>
-        <w:t>AI-augmented research and governance infrastructure strategist. Built 14 custom Python MCP servers (FRED macro data, DefiLlama / CoinGecko / Artemis stablecoin and DeFi data, Helius for Solana, Etherscan / Blockscout for EVM chains, rated.network / Beaconcha.in for validator data, Tally for DAO governance, Dune Analytics, Spacescope, Nansen for wallet flows, and GitHub for specs and code) plus AI-assisted diligence workflows reducing subscription-document review ~4x (4 hours to 1 hour per deal) and automated SEC-filing and press-release monitoring covering ~75 Digital Asset Treasury Stocks (DATs) in 2025. Founding research hire at Borderless Capital (RIA, Dec 2019 to Feb 2026); shipped 250 portfolio investments at ~$500M AUM; predicted Thorchain's $200M insolvency 13 months ahead; sourced the LayerZero seed (~80x). Now founder of Tokenization Systems (Feb 2026 to present); published eight SSRN papers including Governance Concentration Beyond Token Allocation (40-protocol cross-section; protocol sector predicts governance concentration more than initial token allocation; Cohen's d = 0.96 between DePIN and DeFi) and Operational Risk in Token Economies. The control-layer / operator-accountability lens extends to AI deployment via the MVEP-AI extension track (8-skill suite) and A7 Control Layer Theory.</w:t>
+        <w:t>AI-augmented research and governance-infrastructure builder who turns control-layer and operator-accountability research into machine-readable diligence systems, now extending that accountability lens from stablecoin gateways to AI deployment. Founder of Tokenization Systems; first hire at Borderless Capital, an RIA.</w:t>
+      </w:r>
+    </w:p>
+    <w:p>
+      <w:pPr>
+        <w:spacing w:after="40" w:before="0"/>
+      </w:pPr>
+      <w:r>
+        <w:rPr>
+          <w:rFonts w:ascii="Arial" w:cs="Arial" w:eastAsia="Arial" w:hAnsi="Arial"/>
+          <w:color w:val="1A1A1A"/>
+          <w:sz w:val="19"/>
+          <w:szCs w:val="16"/>
+        </w:rPr>
+        <w:t>Focus: research-infrastructure engineering, control-layer accountability, machine-readable diligence, agentic workflow automation · MCP server design, Monte Carlo, difference-in-differences, coalition-power analysis · Python, R, DuneSQL.</w:t>
       </w:r>
     </w:p>
     <w:p>
@@ -198,7 +224,16 @@
         <w:rPr>
           <w:i/>
         </w:rPr>
-        <w:t>Feb 2026 – Present</w:t>
+        <w:t>Feb 2026 to Present</w:t>
+      </w:r>
+    </w:p>
+    <w:p>
+      <w:pPr>
+        <w:spacing w:after="36" w:before="60"/>
+        <w:ind w:left="320" w:hanging="160"/>
+      </w:pPr>
+      <w:r>
+        <w:t>• Filed a US provisional patent for the Canonical-State Architecture (USPTO 64/071,767, May 2026): a five-element coordination system for concurrent AI-agent sessions on a shared version-controlled repository, integrating per-session staging-index isolation, a multi-mode verification engine, a commit-time canonical-state coherence gate, recursive self-validation of discipline codifications, and an operator-confirmed promotion gate (45 claims); validated across ~1,521 commits and 4 to 6 parallel AI coding sessions over ~4 months, with a companion 62-page methodology preprint.</w:t>
       </w:r>
     </w:p>
     <w:p>
@@ -419,7 +454,7 @@
         <w:rPr>
           <w:i/>
         </w:rPr>
-        <w:t>Dec 2019 – Feb 2026</w:t>
+        <w:t>Dec 2019 to Feb 2026</w:t>
       </w:r>
     </w:p>
     <w:p>
@@ -495,15 +530,6 @@
       </w:hyperlink>
       <w:r>
         <w:t>.</w:t>
-      </w:r>
-    </w:p>
-    <w:p>
-      <w:pPr>
-        <w:spacing w:after="36" w:before="60"/>
-        <w:ind w:left="320" w:hanging="160"/>
-      </w:pPr>
-      <w:r>
-        <w:t>• Mapped jurisdictional tax / regulatory advantages of DAT structures over direct crypto holding: Japan's Metaplanet DAT cuts crypto capital-gains tax from up to 55% to 20% (equity rate, further reducible via Japan's IRA structure); Hong Kong's Southbound Connect could give mainland Chinese capital regulated access to crypto banned domestically.</w:t>
       </w:r>
     </w:p>
     <w:p>
@@ -779,7 +805,7 @@
         <w:t>Stack:</w:t>
       </w:r>
       <w:r>
-        <w:t xml:space="preserve"> Python (pandas, statsmodels, scipy, matplotlib), R (fixest, did, synthdid), SQL (DuneSQL, Trino), JavaScript / TypeScript; 14 custom Python MCP servers wrapping the data sources above plus GitHub; Claude.ai + Claude Code + Cursor with 36-skill library and 17-file living-knowledge architecture; n8n, Apify, Git / GitHub</w:t>
+        <w:t xml:space="preserve"> Python (pandas, statsmodels, scipy, matplotlib), R (fixest, did, synthdid), SQL (DuneSQL, Trino), JavaScript / TypeScript; 22 MCP and API connections wrapping the data sources above plus GitHub; Claude.ai + Claude Code + Cursor with 36-skill library and 17-file living-knowledge architecture; n8n, Apify, Git / GitHub</w:t>
       </w:r>
     </w:p>
     <w:p>
@@ -807,16 +833,16 @@
         <w:ind w:left="320" w:hanging="160"/>
       </w:pPr>
       <w:r>
-        <w:t>• Uniswap Foundation governance committee (2024)</w:t>
-      </w:r>
-    </w:p>
-    <w:p>
-      <w:pPr>
-        <w:spacing w:after="36" w:before="60"/>
-        <w:ind w:left="320" w:hanging="160"/>
-      </w:pPr>
-      <w:r>
-        <w:t>• ETHDenver pitch judge</w:t>
+        <w:t>• Uniswap Foundation governance committee (2025)</w:t>
+      </w:r>
+    </w:p>
+    <w:p>
+      <w:pPr>
+        <w:spacing w:after="36" w:before="60"/>
+        <w:ind w:left="320" w:hanging="160"/>
+      </w:pPr>
+      <w:r>
+        <w:t>• ETHDenver pitch judge (2025)</w:t>
       </w:r>
     </w:p>
     <w:p>

</xml_diff>

<commit_message>
Update 6 canonical resume binaries from workflow clone (origin/main 7a190916)
Content changes this cycle: AI Governance new header (AI GOVERNANCE,
CONTROL-LAYER ACCOUNTABILITY, DILIGENCE FRAMEWORKS); Canonical-State
Architecture proof-strip line break plus consolidated Selected-Research
entry with corrected figures (~2,170 commits, 73-page methodology preprint,
37-claim second provisional); Experience-section CSA duplicate removed. All
6 drop the "Founder, Tokenization Systems" subtitle prefix and move 2018
onto the degree line. Quant pricing/business-model and deal-funnel
outcome-lead polish on the relevant variants. SSRN author-link id corrected.

Binaries only; the /resume/ landing pages do not echo resume header text, so
no HTML change is needed. Internal-ref leakage scan clean across all 6.
</commit_message>
<xml_diff>
--- a/resumes/Zukowski_Resume_AI_Governance_Infrastructure.docx
+++ b/resumes/Zukowski_Resume_AI_Governance_Infrastructure.docx
@@ -98,26 +98,11 @@
       </w:pPr>
       <w:r>
         <w:rPr>
-          <w:rFonts w:ascii="Arial" w:cs="Arial" w:eastAsia="Arial" w:hAnsi="Arial"/>
-          <w:b/>
-          <w:bCs/>
-          <w:color w:val="1A1A1A"/>
+          <w:rFonts w:ascii="Arial" w:hAnsi="Arial"/>
+          <w:b/>
           <w:sz w:val="23"/>
-          <w:szCs w:val="23"/>
-        </w:rPr>
-        <w:t>FOUNDER, TOKENIZATION SYSTEMS · AI CONTROL⁠-⁠LAYER ACCOUNTABILITY</w:t>
-        <w:br/>
-      </w:r>
-      <w:r>
-        <w:rPr>
-          <w:rFonts w:ascii="Arial" w:cs="Arial" w:eastAsia="Arial" w:hAnsi="Arial"/>
-          <w:b/>
-          <w:bCs/>
-          <w:color w:val="1A1A1A"/>
-          <w:sz w:val="23"/>
-          <w:szCs w:val="23"/>
-        </w:rPr>
-        <w:t>· MACHINE⁠-⁠READABLE STABLECOIN CLASSIFICATION</w:t>
+        </w:rPr>
+        <w:t>AI GOVERNANCE · CONTROL-LAYER ACCOUNTABILITY · DILIGENCE FRAMEWORKS</w:t>
       </w:r>
     </w:p>
     <w:p>
@@ -132,7 +117,9 @@
           <w:sz w:val="14"/>
           <w:szCs w:val="16"/>
         </w:rPr>
-        <w:t>· 22 MCP + API connections · ~75 DATs analyzed · Diligence⁠-⁠doc review 4hr to 1hr · 8 SSRN papers · 8 federal comment letters · Patent⁠-⁠pending Canonical⁠-⁠State Architecture for multi⁠-⁠agent AI research (USPTO 64/071,767)</w:t>
+        <w:t xml:space="preserve">· 22 MCP + API connections · ~75 DATs analyzed · Diligence⁠-⁠doc review 4hr to 1hr · 8 SSRN papers · 8 federal comment letters</w:t>
+        <w:br/>
+        <w:t xml:space="preserve">· Patent⁠-⁠pending Canonical⁠-⁠State Architecture for multi⁠-⁠agent AI research (USPTO 64/071,767)</w:t>
       </w:r>
     </w:p>
     <w:p>
@@ -233,15 +220,6 @@
         <w:ind w:left="320" w:hanging="160"/>
       </w:pPr>
       <w:r>
-        <w:t>• Filed a US provisional patent for the Canonical-State Architecture (USPTO 64/071,767, May 2026): a five-element coordination system for concurrent AI-agent sessions on a shared version-controlled repository, integrating per-session staging-index isolation, a multi-mode verification engine, a commit-time canonical-state coherence gate, recursive self-validation of discipline codifications, and an operator-confirmed promotion gate (45 claims); validated across ~1,521 commits and 4 to 6 parallel AI coding sessions over ~4 months, with a companion 62-page methodology preprint. A second provisional (USPTO 19/693,448, May 2026) extends the architecture to role-routed cross-session coordination, actual-touched-file collision detection, and a self-describing verification registry.</w:t>
-      </w:r>
-    </w:p>
-    <w:p>
-      <w:pPr>
-        <w:spacing w:after="36" w:before="60"/>
-        <w:ind w:left="320" w:hanging="160"/>
-      </w:pPr>
-      <w:r>
         <w:t xml:space="preserve">• Authored an eight-paper SSRN-live research program covering the </w:t>
       </w:r>
       <w:hyperlink r:id="rId6">
@@ -472,7 +450,7 @@
         <w:ind w:left="320" w:hanging="160"/>
       </w:pPr>
       <w:r>
-        <w:t>• Built quantitative token-economic models forecasting emissions, fee capture, subsidy-to-revenue trajectories, and governance concentration under wide scenario ranges; supply-equilibrium and slashing dynamics supporting Layer 1 mechanism-design advisory.</w:t>
+        <w:t>• Built quantitative token-economic models forecasting emissions, fee capture, pricing and subsidy-to-revenue trajectories, and governance concentration under wide scenario ranges; supply-equilibrium and slashing dynamics supporting Layer 1 business-model and mechanism-design advisory.</w:t>
       </w:r>
     </w:p>
     <w:p>
@@ -547,7 +525,7 @@
         <w:ind w:left="320" w:hanging="160"/>
       </w:pPr>
       <w:r>
-        <w:t>• Led discovery and diligence across a 1,000+ deal investment funnel (pre-seed to Series C); shipped 250 portfolio investments at ~25% deployment rate across ~10 institutional funds (~$500M AUM), with build/partner/hold recommendations to committee.</w:t>
+        <w:t>• Shipped 250 portfolio investments (~25% deployment rate) across ~10 institutional funds (~$500M AUM) from a 1,000+ deal pre-seed-to-Series-C funnel, with build/partner/hold recommendations to committee.</w:t>
       </w:r>
     </w:p>
     <w:p>
@@ -585,8 +563,36 @@
         <w:ind w:left="320" w:hanging="160"/>
       </w:pPr>
       <w:r>
+        <w:rPr>
+          <w:rFonts w:ascii="Arial" w:hAnsi="Arial"/>
+          <w:sz w:val="19"/>
+        </w:rPr>
         <w:t xml:space="preserve">• </w:t>
       </w:r>
+      <w:r>
+        <w:rPr>
+          <w:rFonts w:ascii="Arial" w:hAnsi="Arial"/>
+          <w:b/>
+          <w:sz w:val="19"/>
+        </w:rPr>
+        <w:t>Canonical-State Architecture.</w:t>
+      </w:r>
+      <w:r>
+        <w:rPr>
+          <w:rFonts w:ascii="Arial" w:hAnsi="Arial"/>
+          <w:sz w:val="19"/>
+        </w:rPr>
+        <w:t xml:space="preserve"> Filed a US provisional patent (USPTO 64/071,767, May 2026): a five-element coordination system for concurrent AI-agent sessions on a shared version-controlled repository, integrating per-session staging-index isolation, a multi-mode verification engine, a commit-time canonical-state coherence gate, recursive self-validation of discipline codifications, and an operator-confirmed promotion gate; validated across ~2,170 commits and 4 to 6 parallel AI coding sessions over ~4 months, with a companion 73-page methodology preprint. A second provisional (USPTO 19/693,448, May 2026) extends the architecture to role-routed cross-session coordination, actual-touched-file collision detection, and a self-describing verification registry (37-claim set).</w:t>
+      </w:r>
+    </w:p>
+    <w:p>
+      <w:pPr>
+        <w:spacing w:after="28" w:before="60"/>
+        <w:ind w:left="320" w:hanging="160"/>
+      </w:pPr>
+      <w:r>
+        <w:t xml:space="preserve">• </w:t>
+      </w:r>
       <w:hyperlink r:id="rId10">
         <w:r>
           <w:rPr>
@@ -648,6 +654,10 @@
         <w:ind w:left="320" w:hanging="160"/>
       </w:pPr>
       <w:r>
+        <w:rPr>
+          <w:rFonts w:ascii="Arial" w:hAnsi="Arial"/>
+          <w:sz w:val="19"/>
+        </w:rPr>
         <w:t xml:space="preserve">• </w:t>
       </w:r>
       <w:hyperlink r:id="rId22">
@@ -660,6 +670,10 @@
         </w:r>
       </w:hyperlink>
       <w:r>
+        <w:rPr>
+          <w:rFonts w:ascii="Arial" w:hAnsi="Arial"/>
+          <w:sz w:val="19"/>
+        </w:rPr>
         <w:t xml:space="preserve"> Burn-mechanism design (carrier contracts vs. subscriptions) drives demand concentration: Helium's carrier-contract model concentrates ~90% of token burns in 5 purchasers (HHI 0.22) despite ~1M hotspots; coalition-power analysis extends standard concentration measures for single-address risk.</w:t>
       </w:r>
     </w:p>
@@ -732,6 +746,10 @@
         <w:ind w:left="320" w:hanging="160"/>
       </w:pPr>
       <w:r>
+        <w:rPr>
+          <w:rFonts w:ascii="Arial" w:hAnsi="Arial"/>
+          <w:sz w:val="19"/>
+        </w:rPr>
         <w:t xml:space="preserve">• </w:t>
       </w:r>
       <w:hyperlink r:id="rId24">
@@ -744,6 +762,10 @@
         </w:r>
       </w:hyperlink>
       <w:r>
+        <w:rPr>
+          <w:rFonts w:ascii="Arial" w:hAnsi="Arial"/>
+          <w:sz w:val="19"/>
+        </w:rPr>
         <w:t xml:space="preserve"> Cross-product framework for major dollar-denominated digital products; CLII / MVEP decoupling; stress propagation through dependency chains (SVB, Circle pool, Paxos).</w:t>
       </w:r>
     </w:p>

</xml_diff>

<commit_message>
Resumes: 3CRD acronym fix and experience categorization
- Rename framework acronym TCRD to 3CRD (DEC-165) in the asset-management,
  operator, policy, product, and risk profiles; frameworks hyperlink anchor
  updated to match.
- Group the Borderless experience block under profile-appropriate
  sub-headers in the policy, risk, product, operator, and AI-governance
  profiles. All profiles hold two pages; Selected Research retained in full.

Co-Authored-By: Claude Opus 4.8 (1M context) <noreply@anthropic.com>
</commit_message>
<xml_diff>
--- a/resumes/Zukowski_Resume_AI_Governance_Infrastructure.docx
+++ b/resumes/Zukowski_Resume_AI_Governance_Infrastructure.docx
@@ -437,6 +437,19 @@
     </w:p>
     <w:p>
       <w:pPr>
+        <w:spacing w:after="20" w:before="80"/>
+        <w:ind w:left="0" w:firstLine="0"/>
+      </w:pPr>
+      <w:r>
+        <w:rPr>
+          <w:b/>
+          <w:i/>
+        </w:rPr>
+        <w:t>Research Function &amp; Automation</w:t>
+      </w:r>
+    </w:p>
+    <w:p>
+      <w:pPr>
         <w:spacing w:after="36" w:before="60"/>
         <w:ind w:left="320" w:hanging="160"/>
       </w:pPr>
@@ -450,15 +463,98 @@
         <w:ind w:left="320" w:hanging="160"/>
       </w:pPr>
       <w:r>
+        <w:t>• Built the firm's research function from scratch; led a four-analyst team producing ~25 long-form publications annually; taught 100 teams across nine accelerator programs (2021 to 2025).</w:t>
+      </w:r>
+    </w:p>
+    <w:p>
+      <w:pPr>
+        <w:spacing w:after="20" w:before="80"/>
+        <w:ind w:left="0" w:firstLine="0"/>
+      </w:pPr>
+      <w:r>
+        <w:rPr>
+          <w:b/>
+          <w:i/>
+        </w:rPr>
+        <w:t>Governance Standards Advisory</w:t>
+      </w:r>
+    </w:p>
+    <w:p>
+      <w:pPr>
+        <w:spacing w:after="36" w:before="60"/>
+        <w:ind w:left="320" w:hanging="160"/>
+      </w:pPr>
+      <w:r>
+        <w:t>• Translated regulatory change (GENIUS, CLARITY, Singapore MAS, MiCA, state money-transmitter and trust-charter regimes) into product, reserve, routing, and compliance decisions across U.S., Singapore, Cayman / BVI / Bermuda, and EU; coordinated cross-functional partner work spanning Product / Engineering, Risk (operational-risk taxonomy), and Legal.</w:t>
+      </w:r>
+    </w:p>
+    <w:p>
+      <w:pPr>
+        <w:spacing w:after="36" w:before="60"/>
+        <w:ind w:left="320" w:hanging="160"/>
+      </w:pPr>
+      <w:r>
+        <w:t xml:space="preserve">• Advised 100 portfolio companies 1-on-1 on token mechanism design (stablecoin reserves, governance-token allocation and incentive design, yield wrappers, burn/emission dynamics); standards defined in </w:t>
+      </w:r>
+      <w:hyperlink r:id="rId21">
+        <w:r>
+          <w:rPr>
+            <w:rStyle w:val="Hyperlink"/>
+            <w:b/>
+          </w:rPr>
+          <w:t xml:space="preserve">Introduction to Tokenomics</w:t>
+        </w:r>
+      </w:hyperlink>
+      <w:r>
+        <w:t>.</w:t>
+      </w:r>
+    </w:p>
+    <w:p>
+      <w:pPr>
+        <w:spacing w:after="36" w:before="60"/>
+        <w:ind w:left="320" w:hanging="160"/>
+      </w:pPr>
+      <w:r>
         <w:t>• Built quantitative token-economic models forecasting emissions, fee capture, pricing and subsidy-to-revenue trajectories, and governance concentration under wide scenario ranges; supply-equilibrium and slashing dynamics supporting Layer 1 business-model and mechanism-design advisory.</w:t>
       </w:r>
     </w:p>
     <w:p>
       <w:pPr>
+        <w:spacing w:after="20" w:before="80"/>
+        <w:ind w:left="0" w:firstLine="0"/>
+      </w:pPr>
+      <w:r>
+        <w:rPr>
+          <w:b/>
+          <w:i/>
+        </w:rPr>
+        <w:t>Investment &amp; Conviction Calls</w:t>
+      </w:r>
+    </w:p>
+    <w:p>
+      <w:pPr>
         <w:spacing w:after="36" w:before="60"/>
         <w:ind w:left="320" w:hanging="160"/>
       </w:pPr>
       <w:r>
+        <w:t xml:space="preserve">• Sourced the </w:t>
+      </w:r>
+      <w:r>
+        <w:rPr>
+          <w:b/>
+        </w:rPr>
+        <w:t>LayerZero seed round</w:t>
+      </w:r>
+      <w:r>
+        <w:t xml:space="preserve"> investment for Borderless, returning ~80x; the underlying cross-chain interoperability thesis preceded the firm's Cross-Chain Ecosystem Fund by two years.</w:t>
+      </w:r>
+    </w:p>
+    <w:p>
+      <w:pPr>
+        <w:spacing w:after="36" w:before="60"/>
+        <w:ind w:left="320" w:hanging="160"/>
+      </w:pPr>
+      <w:r>
         <w:t xml:space="preserve">• Predicted Thorchain's </w:t>
       </w:r>
       <w:r>
@@ -477,64 +573,7 @@
         <w:ind w:left="320" w:hanging="160"/>
       </w:pPr>
       <w:r>
-        <w:t xml:space="preserve">• Sourced the </w:t>
-      </w:r>
-      <w:r>
-        <w:rPr>
-          <w:b/>
-        </w:rPr>
-        <w:t>LayerZero seed round</w:t>
-      </w:r>
-      <w:r>
-        <w:t xml:space="preserve"> investment for Borderless, returning ~80x; the underlying cross-chain interoperability thesis preceded the firm's Cross-Chain Ecosystem Fund by two years.</w:t>
-      </w:r>
-    </w:p>
-    <w:p>
-      <w:pPr>
-        <w:spacing w:after="36" w:before="60"/>
-        <w:ind w:left="320" w:hanging="160"/>
-      </w:pPr>
-      <w:r>
-        <w:t xml:space="preserve">• Advised 100 portfolio companies 1-on-1 on token mechanism design (stablecoin reserves, governance-token allocation and incentive design, yield wrappers, burn/emission dynamics); standards defined in </w:t>
-      </w:r>
-      <w:hyperlink r:id="rId21">
-        <w:r>
-          <w:rPr>
-            <w:rStyle w:val="Hyperlink"/>
-            <w:b/>
-          </w:rPr>
-          <w:t xml:space="preserve">Introduction to Tokenomics</w:t>
-        </w:r>
-      </w:hyperlink>
-      <w:r>
-        <w:t>.</w:t>
-      </w:r>
-    </w:p>
-    <w:p>
-      <w:pPr>
-        <w:spacing w:after="36" w:before="60"/>
-        <w:ind w:left="320" w:hanging="160"/>
-      </w:pPr>
-      <w:r>
-        <w:t>• Translated regulatory change (GENIUS, CLARITY, Singapore MAS, MiCA, state money-transmitter and trust-charter regimes) into product, reserve, routing, and compliance decisions across U.S., Singapore, Cayman / BVI / Bermuda, and EU; coordinated cross-functional partner work spanning Product / Engineering, Risk (operational-risk taxonomy), and Legal.</w:t>
-      </w:r>
-    </w:p>
-    <w:p>
-      <w:pPr>
-        <w:spacing w:after="36" w:before="60"/>
-        <w:ind w:left="320" w:hanging="160"/>
-      </w:pPr>
-      <w:r>
         <w:t>• Shipped 250 portfolio investments (~25% deployment rate) across ~10 institutional funds (~$500M AUM) from a 1,000+ deal pre-seed-to-Series-C funnel, with build/partner/hold recommendations to committee.</w:t>
-      </w:r>
-    </w:p>
-    <w:p>
-      <w:pPr>
-        <w:spacing w:after="36" w:before="60"/>
-        <w:ind w:left="320" w:hanging="160"/>
-      </w:pPr>
-      <w:r>
-        <w:t>• Built the firm's research function from scratch; led a four-analyst team producing ~25 long-form publications annually; taught 100 teams across nine accelerator programs (2021 to 2025).</w:t>
       </w:r>
     </w:p>
     <w:p>

</xml_diff>

<commit_message>
Resumes: update B2 paper entry to current canonical title and numbers
Selected Research entry for the governance paper updated to match the
2026-06-03 R2 retitle and current abstract: "Auditing Governance Concentration
Beyond Token Allocation"; 52-protocol live-governance audit (was 40); sector
contrast reframed as a directionally robust medium effect, Cohen's d = 0.65
(was 0.96). Applied to all six profiles.

Co-Authored-By: Claude Opus 4.8 (1M context) <noreply@anthropic.com>
</commit_message>
<xml_diff>
--- a/resumes/Zukowski_Resume_AI_Governance_Infrastructure.docx
+++ b/resumes/Zukowski_Resume_AI_Governance_Infrastructure.docx
@@ -638,11 +638,11 @@
             <w:rStyle w:val="Hyperlink"/>
             <w:b/>
           </w:rPr>
-          <w:t xml:space="preserve">Governance Concentration Beyond Token Allocation.</w:t>
-        </w:r>
-      </w:hyperlink>
-      <w:r>
-        <w:t xml:space="preserve"> In peer review at Frontiers in Blockchain. 40-protocol cross-section: initial token allocation does not predict governance concentration; protocol sector does (DePIN significantly more concentrated than DeFi; Cohen's d = 0.96).</w:t>
+          <w:t xml:space="preserve">Auditing Governance Concentration Beyond Token Allocation.</w:t>
+        </w:r>
+      </w:hyperlink>
+      <w:r>
+        <w:t xml:space="preserve"> In peer review at Frontiers in Blockchain. Live-governance audit of 52 token protocols: launch allocation does not predict governance concentration; DePIN governance is more concentrated than DeFi after correction (Cohen's d = 0.65, a directionally robust medium effect).</w:t>
       </w:r>
     </w:p>
     <w:p>

</xml_diff>

<commit_message>
Resumes: hyperlink-weight normalization across all six variants
In-prose hyperlinks now render regular weight (five to six bold outliers per
variant normalized: the framework-name links and Introduction to Tokenomics);
Selected Research entry-title links stay bold as uniform entry headers. All
six DOCX + PDF pairs re-rendered; two pages each; content otherwise unchanged.
Wholesale binary replacement from the build source of record (adddc49f).

Co-Authored-By: Claude Opus 4.8 (1M context) <noreply@anthropic.com>
</commit_message>
<xml_diff>
--- a/resumes/Zukowski_Resume_AI_Governance_Infrastructure.docx
+++ b/resumes/Zukowski_Resume_AI_Governance_Infrastructure.docx
@@ -226,7 +226,6 @@
         <w:r>
           <w:rPr>
             <w:rStyle w:val="Hyperlink"/>
-            <w:b/>
           </w:rPr>
           <w:t xml:space="preserve">Control Layer Intensity Index</w:t>
         </w:r>
@@ -238,7 +237,6 @@
         <w:r>
           <w:rPr>
             <w:rStyle w:val="Hyperlink"/>
-            <w:b/>
           </w:rPr>
           <w:t xml:space="preserve">Minimum Viable Equivalence Pack</w:t>
         </w:r>
@@ -250,7 +248,6 @@
         <w:r>
           <w:rPr>
             <w:rStyle w:val="Hyperlink"/>
-            <w:b/>
           </w:rPr>
           <w:t xml:space="preserve">Adaptive Tokenomics</w:t>
         </w:r>
@@ -500,7 +497,6 @@
         <w:r>
           <w:rPr>
             <w:rStyle w:val="Hyperlink"/>
-            <w:b/>
           </w:rPr>
           <w:t xml:space="preserve">Introduction to Tokenomics</w:t>
         </w:r>
@@ -918,7 +914,6 @@
         <w:r>
           <w:rPr>
             <w:rStyle w:val="Hyperlink"/>
-            <w:b/>
           </w:rPr>
           <w:t xml:space="preserve">Introduction to Tokenomics</w:t>
         </w:r>

</xml_diff>

<commit_message>
content: update downloadable resume docx and pdf to eight USPTO applications
The 2026-07-01 eight-application deploy (838abd448) updated the /resume HTML pages
and the hero and speaker surfaces but left the six downloadable resume docx and pdf
reading "five USPTO provisional applications". Bring the downloadable artifacts in
line with the live pages: surgical patent-line edit five to eight (AI-governance
also gains the "and cited values" evidence-grounding subject for the eighth
application, 64/102,816); pdfs regenerated from the edited docx. Count form only;
no individual application numbers and no mechanism on these public artifacts. All
six read eight at 2 pages.
</commit_message>
<xml_diff>
--- a/resumes/Zukowski_Resume_AI_Governance_Infrastructure.docx
+++ b/resumes/Zukowski_Resume_AI_Governance_Infrastructure.docx
@@ -119,7 +119,7 @@
         </w:rPr>
         <w:t>· 22 MCP + API connections · ~75 DATs analyzed · Diligence⁠-⁠doc review 4hr to 1hr · 8 SSRN papers · 12 federal comment letters</w:t>
         <w:br/>
-        <w:t>· Patent⁠-⁠pending Canonical⁠-⁠State Architecture for multi⁠-⁠agent AI research (five USPTO provisional applications, 2026)</w:t>
+        <w:t>· Patent⁠-⁠pending Canonical⁠-⁠State Architecture for multi⁠-⁠agent AI research (eight USPTO provisional applications, 2026)</w:t>
       </w:r>
     </w:p>
     <w:p>
@@ -617,7 +617,7 @@
           <w:rFonts w:ascii="Arial" w:hAnsi="Arial"/>
           <w:sz w:val="19"/>
         </w:rPr>
-        <w:t xml:space="preserve"> Filed five US provisional patent applications in 2026: a five-element coordination system for concurrent AI-agent sessions on a shared version-controlled repository, integrating per-session staging-index isolation, a multi-mode verification engine, a commit-time canonical-state coherence gate, recursive self-validation of discipline codifications, and an operator-confirmed promotion gate; validated across ~2,170 commits and 4 to 6 parallel AI coding sessions over ~4 months, with a companion 73-page methodology preprint. The applications extend the architecture to role-routed cross-session coordination, actual-touched-file collision detection, and a self-describing verification registry, plus a separate application for evidence-grounding of AI-generated assessments.</w:t>
+        <w:t xml:space="preserve"> Filed eight US provisional patent applications in 2026: a five-element coordination system for concurrent AI-agent sessions on a shared version-controlled repository, integrating per-session staging-index isolation, a multi-mode verification engine, a commit-time canonical-state coherence gate, recursive self-validation of discipline codifications, and an operator-confirmed promotion gate; validated across ~2,170 commits and 4 to 6 parallel AI coding sessions over ~4 months, with a companion 73-page methodology preprint. The applications extend the architecture to role-routed cross-session coordination, actual-touched-file collision detection, and a self-describing verification registry, plus separate applications for evidence-grounding of AI-generated assessments and cited values.</w:t>
       </w:r>
     </w:p>
     <w:p>

</xml_diff>

<commit_message>
content: re-render downloadable resume docx and pdf from canonical source (eight USPTO)
Full source-driven re-render of the six role resumes (render_canonical from
resume_spec.py, auto-fit to 2 pages), replacing the prior surgical artifacts with the
canonical build. All six read "eight USPTO provisional applications" at 2 pages; zero
five/seven. Downloadable docx and pdf only; the /resume pages already read eight.
</commit_message>
<xml_diff>
--- a/resumes/Zukowski_Resume_AI_Governance_Infrastructure.docx
+++ b/resumes/Zukowski_Resume_AI_Governance_Infrastructure.docx
@@ -4,7 +4,7 @@
   <w:body>
     <w:p>
       <w:pPr>
-        <w:spacing w:after="20" w:before="60"/>
+        <w:spacing w:after="20"/>
         <w:jc w:val="center"/>
       </w:pPr>
       <w:r>
@@ -13,15 +13,15 @@
           <w:b/>
           <w:bCs/>
           <w:color w:val="1A1A1A"/>
-          <w:sz w:val="36"/>
-          <w:szCs w:val="36"/>
+          <w:sz w:val="40"/>
+          <w:szCs w:val="40"/>
         </w:rPr>
         <w:t xml:space="preserve">Zach Zukowski</w:t>
       </w:r>
     </w:p>
     <w:p>
       <w:pPr>
-        <w:spacing w:after="10" w:before="60"/>
+        <w:spacing w:after="10"/>
         <w:jc w:val="center"/>
       </w:pPr>
       <w:r>
@@ -29,14 +29,14 @@
           <w:rFonts w:ascii="Arial" w:cs="Arial" w:eastAsia="Arial" w:hAnsi="Arial"/>
           <w:color w:val="444444"/>
           <w:sz w:val="19"/>
-          <w:szCs w:val="16"/>
+          <w:szCs w:val="19"/>
         </w:rPr>
         <w:t xml:space="preserve">Orlando, FL | Zach@Tokenization.Systems | 407-536-8625</w:t>
       </w:r>
     </w:p>
     <w:p>
       <w:pPr>
-        <w:spacing w:after="55" w:before="60"/>
+        <w:spacing w:after="55"/>
         <w:jc w:val="center"/>
       </w:pPr>
       <w:hyperlink w:history="1" r:id="rIdtk3pkbjp0bnea-khivcha">
@@ -45,7 +45,7 @@
             <w:rFonts w:ascii="Arial" w:cs="Arial" w:eastAsia="Arial" w:hAnsi="Arial"/>
             <w:color w:val="2255AA"/>
             <w:sz w:val="19"/>
-            <w:szCs w:val="16"/>
+            <w:szCs w:val="19"/>
           </w:rPr>
           <w:t xml:space="preserve">Tokenization.Systems</w:t>
         </w:r>
@@ -55,7 +55,7 @@
           <w:rFonts w:ascii="Arial" w:cs="Arial" w:eastAsia="Arial" w:hAnsi="Arial"/>
           <w:color w:val="444444"/>
           <w:sz w:val="19"/>
-          <w:szCs w:val="16"/>
+          <w:szCs w:val="19"/>
         </w:rPr>
         <w:t xml:space="preserve">  |  </w:t>
       </w:r>
@@ -65,7 +65,7 @@
             <w:rFonts w:ascii="Arial" w:cs="Arial" w:eastAsia="Arial" w:hAnsi="Arial"/>
             <w:color w:val="2255AA"/>
             <w:sz w:val="19"/>
-            <w:szCs w:val="16"/>
+            <w:szCs w:val="19"/>
           </w:rPr>
           <w:t xml:space="preserve">LinkedIn</w:t>
         </w:r>
@@ -75,7 +75,7 @@
           <w:rFonts w:ascii="Arial" w:cs="Arial" w:eastAsia="Arial" w:hAnsi="Arial"/>
           <w:color w:val="444444"/>
           <w:sz w:val="19"/>
-          <w:szCs w:val="16"/>
+          <w:szCs w:val="19"/>
         </w:rPr>
         <w:t xml:space="preserve">  |  </w:t>
       </w:r>
@@ -85,7 +85,7 @@
             <w:rFonts w:ascii="Arial" w:cs="Arial" w:eastAsia="Arial" w:hAnsi="Arial"/>
             <w:color w:val="2255AA"/>
             <w:sz w:val="19"/>
-            <w:szCs w:val="16"/>
+            <w:szCs w:val="19"/>
           </w:rPr>
           <w:t xml:space="preserve">SSRN</w:t>
         </w:r>
@@ -93,29 +93,31 @@
     </w:p>
     <w:p>
       <w:pPr>
-        <w:spacing w:after="15" w:before="60"/>
+        <w:spacing w:after="15"/>
         <w:jc w:val="center"/>
       </w:pPr>
       <w:r>
         <w:rPr>
-          <w:rFonts w:ascii="Arial" w:hAnsi="Arial"/>
-          <w:b/>
+          <w:rFonts w:ascii="Arial" w:cs="Arial" w:eastAsia="Arial" w:hAnsi="Arial"/>
+          <w:b/>
+          <w:bCs/>
+          <w:color w:val="1A1A1A"/>
           <w:sz w:val="23"/>
+          <w:szCs w:val="23"/>
         </w:rPr>
         <w:t>AI GOVERNANCE · CONTROL-LAYER ACCOUNTABILITY · DILIGENCE FRAMEWORKS</w:t>
       </w:r>
     </w:p>
     <w:p>
       <w:pPr>
-        <w:spacing w:after="10" w:before="60"/>
+        <w:spacing w:after="10"/>
         <w:jc w:val="center"/>
       </w:pPr>
       <w:r>
         <w:rPr>
-          <w:rFonts w:ascii="Arial" w:cs="Arial" w:eastAsia="Arial" w:hAnsi="Arial"/>
-          <w:color w:val="444444"/>
-          <w:sz w:val="14"/>
-          <w:szCs w:val="16"/>
+          <w:b w:val="0"/>
+          <w:i w:val="0"/>
+          <w:sz w:val="18"/>
         </w:rPr>
         <w:t>· 22 MCP + API connections · ~75 DATs analyzed · Diligence⁠-⁠doc review 4hr to 1hr · 8 SSRN papers · 12 federal comment letters</w:t>
         <w:br/>
@@ -143,28 +145,28 @@
     </w:p>
     <w:p>
       <w:pPr>
-        <w:spacing w:after="40" w:before="60"/>
+        <w:spacing w:after="40" w:before="160"/>
       </w:pPr>
       <w:r>
         <w:rPr>
           <w:rFonts w:ascii="Arial" w:cs="Arial" w:eastAsia="Arial" w:hAnsi="Arial"/>
           <w:color w:val="1A1A1A"/>
           <w:sz w:val="19"/>
-          <w:szCs w:val="16"/>
+          <w:szCs w:val="19"/>
         </w:rPr>
         <w:t>AI-augmented research and governance-infrastructure builder who turns control-layer and operator-accountability research into machine-readable diligence systems, now extending that accountability lens from stablecoin gateways to AI deployment. Founder of Tokenization Systems; first hire at Borderless Capital, an RIA.</w:t>
       </w:r>
     </w:p>
     <w:p>
       <w:pPr>
-        <w:spacing w:after="40" w:before="0"/>
+        <w:spacing w:after="38"/>
       </w:pPr>
       <w:r>
         <w:rPr>
           <w:rFonts w:ascii="Arial" w:cs="Arial" w:eastAsia="Arial" w:hAnsi="Arial"/>
           <w:color w:val="1A1A1A"/>
           <w:sz w:val="19"/>
-          <w:szCs w:val="16"/>
+          <w:szCs w:val="19"/>
         </w:rPr>
         <w:t>Focus: research-infrastructure engineering, control-layer accountability, machine-readable diligence, agentic workflow automation · MCP server design, Monte Carlo, difference-in-differences, coalition-power analysis · Python, R, DuneSQL.</w:t>
       </w:r>
@@ -216,7 +218,7 @@
     </w:p>
     <w:p>
       <w:pPr>
-        <w:spacing w:after="36" w:before="60"/>
+        <w:spacing w:after="36"/>
         <w:ind w:left="320" w:hanging="160"/>
       </w:pPr>
       <w:r>
@@ -280,7 +282,7 @@
     </w:p>
     <w:p>
       <w:pPr>
-        <w:spacing w:after="36" w:before="60"/>
+        <w:spacing w:after="36"/>
         <w:ind w:left="320" w:hanging="160"/>
       </w:pPr>
       <w:r>
@@ -399,7 +401,7 @@
     </w:p>
     <w:p>
       <w:pPr>
-        <w:spacing w:after="36" w:before="60"/>
+        <w:spacing w:after="36"/>
         <w:ind w:left="320" w:hanging="160"/>
       </w:pPr>
       <w:r>
@@ -434,6 +436,9 @@
     </w:p>
     <w:p>
       <w:pPr>
+        <w:tabs>
+          <w:tab w:val="right" w:pos="10320"/>
+        </w:tabs>
         <w:spacing w:after="20" w:before="80"/>
         <w:ind w:left="0" w:firstLine="0"/>
       </w:pPr>
@@ -447,7 +452,7 @@
     </w:p>
     <w:p>
       <w:pPr>
-        <w:spacing w:after="36" w:before="60"/>
+        <w:spacing w:after="36"/>
         <w:ind w:left="320" w:hanging="160"/>
       </w:pPr>
       <w:r>
@@ -456,7 +461,7 @@
     </w:p>
     <w:p>
       <w:pPr>
-        <w:spacing w:after="36" w:before="60"/>
+        <w:spacing w:after="36"/>
         <w:ind w:left="320" w:hanging="160"/>
       </w:pPr>
       <w:r>
@@ -465,6 +470,9 @@
     </w:p>
     <w:p>
       <w:pPr>
+        <w:tabs>
+          <w:tab w:val="right" w:pos="10320"/>
+        </w:tabs>
         <w:spacing w:after="20" w:before="80"/>
         <w:ind w:left="0" w:firstLine="0"/>
       </w:pPr>
@@ -478,7 +486,7 @@
     </w:p>
     <w:p>
       <w:pPr>
-        <w:spacing w:after="36" w:before="60"/>
+        <w:spacing w:after="36"/>
         <w:ind w:left="320" w:hanging="160"/>
       </w:pPr>
       <w:r>
@@ -487,7 +495,7 @@
     </w:p>
     <w:p>
       <w:pPr>
-        <w:spacing w:after="36" w:before="60"/>
+        <w:spacing w:after="36"/>
         <w:ind w:left="320" w:hanging="160"/>
       </w:pPr>
       <w:r>
@@ -507,7 +515,7 @@
     </w:p>
     <w:p>
       <w:pPr>
-        <w:spacing w:after="36" w:before="60"/>
+        <w:spacing w:after="36"/>
         <w:ind w:left="320" w:hanging="160"/>
       </w:pPr>
       <w:r>
@@ -516,6 +524,9 @@
     </w:p>
     <w:p>
       <w:pPr>
+        <w:tabs>
+          <w:tab w:val="right" w:pos="10320"/>
+        </w:tabs>
         <w:spacing w:after="20" w:before="80"/>
         <w:ind w:left="0" w:firstLine="0"/>
       </w:pPr>
@@ -529,7 +540,7 @@
     </w:p>
     <w:p>
       <w:pPr>
-        <w:spacing w:after="36" w:before="60"/>
+        <w:spacing w:after="36"/>
         <w:ind w:left="320" w:hanging="160"/>
       </w:pPr>
       <w:r>
@@ -547,7 +558,7 @@
     </w:p>
     <w:p>
       <w:pPr>
-        <w:spacing w:after="36" w:before="60"/>
+        <w:spacing w:after="36"/>
         <w:ind w:left="320" w:hanging="160"/>
       </w:pPr>
       <w:r>
@@ -565,7 +576,7 @@
     </w:p>
     <w:p>
       <w:pPr>
-        <w:spacing w:after="36" w:before="60"/>
+        <w:spacing w:after="36"/>
         <w:ind w:left="320" w:hanging="160"/>
       </w:pPr>
       <w:r>
@@ -594,35 +605,25 @@
     </w:p>
     <w:p>
       <w:pPr>
-        <w:spacing w:after="28" w:before="60"/>
-        <w:ind w:left="320" w:hanging="160"/>
-      </w:pPr>
-      <w:r>
-        <w:rPr>
-          <w:rFonts w:ascii="Arial" w:hAnsi="Arial"/>
-          <w:sz w:val="19"/>
-        </w:rPr>
+        <w:spacing w:after="28"/>
+        <w:ind w:left="320" w:hanging="160"/>
+      </w:pPr>
+      <w:r>
         <w:t xml:space="preserve">• </w:t>
       </w:r>
       <w:r>
         <w:rPr>
-          <w:rFonts w:ascii="Arial" w:hAnsi="Arial"/>
-          <w:b/>
-          <w:sz w:val="19"/>
+          <w:b/>
         </w:rPr>
         <w:t>Canonical-State Architecture.</w:t>
       </w:r>
       <w:r>
-        <w:rPr>
-          <w:rFonts w:ascii="Arial" w:hAnsi="Arial"/>
-          <w:sz w:val="19"/>
-        </w:rPr>
         <w:t xml:space="preserve"> Filed eight US provisional patent applications in 2026: a five-element coordination system for concurrent AI-agent sessions on a shared version-controlled repository, integrating per-session staging-index isolation, a multi-mode verification engine, a commit-time canonical-state coherence gate, recursive self-validation of discipline codifications, and an operator-confirmed promotion gate; validated across ~2,170 commits and 4 to 6 parallel AI coding sessions over ~4 months, with a companion 73-page methodology preprint. The applications extend the architecture to role-routed cross-session coordination, actual-touched-file collision detection, and a self-describing verification registry, plus separate applications for evidence-grounding of AI-generated assessments and cited values.</w:t>
       </w:r>
     </w:p>
     <w:p>
       <w:pPr>
-        <w:spacing w:after="28" w:before="60"/>
+        <w:spacing w:after="28"/>
         <w:ind w:left="320" w:hanging="160"/>
       </w:pPr>
       <w:r>
@@ -643,7 +644,7 @@
     </w:p>
     <w:p>
       <w:pPr>
-        <w:spacing w:after="28" w:before="60"/>
+        <w:spacing w:after="28"/>
         <w:ind w:left="320" w:hanging="160"/>
       </w:pPr>
       <w:r>
@@ -664,7 +665,7 @@
     </w:p>
     <w:p>
       <w:pPr>
-        <w:spacing w:after="28" w:before="60"/>
+        <w:spacing w:after="28"/>
         <w:ind w:left="320" w:hanging="160"/>
       </w:pPr>
       <w:r>
@@ -685,14 +686,10 @@
     </w:p>
     <w:p>
       <w:pPr>
-        <w:spacing w:after="28" w:before="60"/>
-        <w:ind w:left="320" w:hanging="160"/>
-      </w:pPr>
-      <w:r>
-        <w:rPr>
-          <w:rFonts w:ascii="Arial" w:hAnsi="Arial"/>
-          <w:sz w:val="19"/>
-        </w:rPr>
+        <w:spacing w:after="28"/>
+        <w:ind w:left="320" w:hanging="160"/>
+      </w:pPr>
+      <w:r>
         <w:t xml:space="preserve">• </w:t>
       </w:r>
       <w:hyperlink r:id="rId22">
@@ -705,16 +702,12 @@
         </w:r>
       </w:hyperlink>
       <w:r>
-        <w:rPr>
-          <w:rFonts w:ascii="Arial" w:hAnsi="Arial"/>
-          <w:sz w:val="19"/>
-        </w:rPr>
         <w:t xml:space="preserve"> Burn-mechanism design (carrier contracts vs. subscriptions) drives demand concentration: Helium's carrier-contract model concentrates ~90% of token burns in 5 purchasers (HHI 0.22) despite ~1M hotspots; coalition-power analysis extends standard concentration measures for single-address risk.</w:t>
       </w:r>
     </w:p>
     <w:p>
       <w:pPr>
-        <w:spacing w:after="28" w:before="60"/>
+        <w:spacing w:after="28"/>
         <w:ind w:left="320" w:hanging="160"/>
       </w:pPr>
       <w:r>
@@ -735,7 +728,7 @@
     </w:p>
     <w:p>
       <w:pPr>
-        <w:spacing w:after="28" w:before="60"/>
+        <w:spacing w:after="28"/>
         <w:ind w:left="320" w:hanging="160"/>
       </w:pPr>
       <w:r>
@@ -756,7 +749,7 @@
     </w:p>
     <w:p>
       <w:pPr>
-        <w:spacing w:after="28" w:before="60"/>
+        <w:spacing w:after="28"/>
         <w:ind w:left="320" w:hanging="160"/>
       </w:pPr>
       <w:r>
@@ -777,14 +770,10 @@
     </w:p>
     <w:p>
       <w:pPr>
-        <w:spacing w:after="28" w:before="60"/>
-        <w:ind w:left="320" w:hanging="160"/>
-      </w:pPr>
-      <w:r>
-        <w:rPr>
-          <w:rFonts w:ascii="Arial" w:hAnsi="Arial"/>
-          <w:sz w:val="19"/>
-        </w:rPr>
+        <w:spacing w:after="28"/>
+        <w:ind w:left="320" w:hanging="160"/>
+      </w:pPr>
+      <w:r>
         <w:t xml:space="preserve">• </w:t>
       </w:r>
       <w:hyperlink r:id="rId24">
@@ -797,10 +786,6 @@
         </w:r>
       </w:hyperlink>
       <w:r>
-        <w:rPr>
-          <w:rFonts w:ascii="Arial" w:hAnsi="Arial"/>
-          <w:sz w:val="19"/>
-        </w:rPr>
         <w:t xml:space="preserve"> Cross-product framework for major dollar-denominated digital products; CLII / MVEP decoupling; stress propagation through dependency chains (SVB, Circle pool, Paxos).</w:t>
       </w:r>
     </w:p>
@@ -825,7 +810,7 @@
     </w:p>
     <w:p>
       <w:pPr>
-        <w:spacing w:after="22" w:before="60"/>
+        <w:spacing w:after="22"/>
       </w:pPr>
       <w:r>
         <w:rPr>
@@ -839,7 +824,7 @@
     </w:p>
     <w:p>
       <w:pPr>
-        <w:spacing w:after="22" w:before="60"/>
+        <w:spacing w:after="22"/>
       </w:pPr>
       <w:r>
         <w:rPr>
@@ -853,7 +838,7 @@
     </w:p>
     <w:p>
       <w:pPr>
-        <w:spacing w:after="22" w:before="60"/>
+        <w:spacing w:after="22"/>
       </w:pPr>
       <w:r>
         <w:rPr>
@@ -886,7 +871,7 @@
     </w:p>
     <w:p>
       <w:pPr>
-        <w:spacing w:after="36" w:before="60"/>
+        <w:spacing w:after="36"/>
         <w:ind w:left="320" w:hanging="160"/>
       </w:pPr>
       <w:r>
@@ -895,7 +880,7 @@
     </w:p>
     <w:p>
       <w:pPr>
-        <w:spacing w:after="36" w:before="60"/>
+        <w:spacing w:after="36"/>
         <w:ind w:left="320" w:hanging="160"/>
       </w:pPr>
       <w:r>
@@ -904,7 +889,7 @@
     </w:p>
     <w:p>
       <w:pPr>
-        <w:spacing w:after="36" w:before="60"/>
+        <w:spacing w:after="36"/>
         <w:ind w:left="320" w:hanging="160"/>
       </w:pPr>
       <w:r>
@@ -946,58 +931,48 @@
         <w:tabs>
           <w:tab w:val="right" w:pos="10320"/>
         </w:tabs>
-        <w:spacing w:after="0" w:before="60"/>
-      </w:pPr>
-      <w:r>
-        <w:rPr>
-          <w:rFonts w:ascii="Arial" w:cs="Arial" w:eastAsia="Arial" w:hAnsi="Arial"/>
-          <w:b/>
-          <w:bCs/>
-          <w:color w:val="1A1A1A"/>
-          <w:sz w:val="19"/>
-          <w:szCs w:val="19"/>
-        </w:rPr>
-        <w:t xml:space="preserve">High Point University</w:t>
-      </w:r>
-      <w:r>
-        <w:rPr>
-          <w:rFonts w:ascii="Arial" w:cs="Arial" w:eastAsia="Arial" w:hAnsi="Arial"/>
-          <w:color w:val="1A1A1A"/>
-          <w:sz w:val="19"/>
-          <w:szCs w:val="19"/>
+        <w:spacing w:after="0"/>
+      </w:pPr>
+      <w:r>
+        <w:rPr>
+          <w:b/>
+          <w:i w:val="0"/>
+        </w:rPr>
+        <w:t>High Point University</w:t>
+      </w:r>
+      <w:r>
+        <w:rPr>
+          <w:b w:val="0"/>
+          <w:i w:val="0"/>
         </w:rPr>
         <w:t xml:space="preserve"> | B.S.B.A., Business Administration (Magna Cum Laude) · Investment Club President</w:t>
       </w:r>
       <w:r>
         <w:rPr>
-          <w:rFonts w:ascii="Arial" w:cs="Arial" w:eastAsia="Arial" w:hAnsi="Arial"/>
-          <w:sz w:val="19"/>
-          <w:szCs w:val="19"/>
-        </w:rPr>
-        <w:t xml:space="preserve">	</w:t>
-      </w:r>
-      <w:r>
-        <w:rPr>
-          <w:rFonts w:ascii="Arial" w:cs="Arial" w:eastAsia="Arial" w:hAnsi="Arial"/>
+          <w:b w:val="0"/>
+          <w:i w:val="0"/>
+        </w:rPr>
+        <w:tab/>
+      </w:r>
+      <w:r>
+        <w:rPr>
+          <w:b w:val="0"/>
           <w:i/>
-          <w:iCs/>
-          <w:color w:val="666666"/>
-          <w:sz w:val="19"/>
-          <w:szCs w:val="19"/>
-        </w:rPr>
-        <w:t xml:space="preserve">2018</w:t>
-      </w:r>
-    </w:p>
-    <w:p>
-      <w:pPr>
-        <w:spacing w:after="0" w:before="60"/>
-      </w:pPr>
-      <w:r>
-        <w:rPr>
-          <w:rFonts w:ascii="Arial" w:cs="Arial" w:eastAsia="Arial" w:hAnsi="Arial"/>
-          <w:color w:val="444444"/>
-          <w:sz w:val="18"/>
-          <w:szCs w:val="18"/>
+        </w:rPr>
+        <w:t>2018</w:t>
+      </w:r>
+    </w:p>
+    <w:p>
+      <w:pPr>
+        <w:tabs>
+          <w:tab w:val="right" w:pos="10320"/>
+        </w:tabs>
+        <w:spacing w:after="0"/>
+      </w:pPr>
+      <w:r>
+        <w:rPr>
+          <w:b w:val="0"/>
+          <w:i w:val="0"/>
         </w:rPr>
         <w:t>Lingnan University, Hong Kong (Exchange)</w:t>
       </w:r>

</xml_diff>

<commit_message>
Advance federal letter count twelve to thirteen on remaining surfaces; add B2 cover to governance card
Surgical re-apply from the workflow clone (Claude1 c06db9c09 + 70d145a81):
the June 30 AG29 cycle advanced the letters index, overview, and research
pages but missed the homepage letters link, 404 JSON-LD, six frameworks
spots, two NCUA-supplemental cross-links, the FSB companion card, and the
resume pages (policy and product enumerations extended with the AG29
rulemaking). Resume DOCX/PDF downloads refreshed to the thirteen count
(all six verified at 2 pages).

Also adds the missing cover image to the Auditing Governance Concentration
card on the AI-governance resume (the only research card on the page
without one; B2_Sector_Concentration_N52 webp + png fallback), and
advances the eight-paper-program bullet there from "under review" to
"accepted for publication at Frontiers in Blockchain, in production".

Co-Authored-By: Claude Fable 5 <noreply@anthropic.com>
</commit_message>
<xml_diff>
--- a/resumes/Zukowski_Resume_AI_Governance_Infrastructure.docx
+++ b/resumes/Zukowski_Resume_AI_Governance_Infrastructure.docx
@@ -119,7 +119,7 @@
           <w:i w:val="0"/>
           <w:sz w:val="18"/>
         </w:rPr>
-        <w:t>· 22 MCP + API connections · ~75 DATs analyzed · Diligence⁠-⁠doc review 4hr to 1hr · 8 SSRN papers · 12 federal comment letters</w:t>
+        <w:t>· 22 MCP + API connections · ~75 DATs analyzed · Diligence⁠-⁠doc review 4hr to 1hr · 8 SSRN papers · 13 federal comment letters</w:t>
         <w:br/>
         <w:t>· Patent⁠-⁠pending Canonical⁠-⁠State Architecture for multi⁠-⁠agent AI research (eight USPTO provisional applications, 2026)</w:t>
       </w:r>
@@ -286,7 +286,7 @@
         <w:ind w:left="320" w:hanging="160"/>
       </w:pPr>
       <w:r>
-        <w:t xml:space="preserve">• Contributed twelve comment letters across a federal regulatory program (OCC bank stablecoin engagement </w:t>
+        <w:t xml:space="preserve">• Contributed thirteen comment letters across a federal regulatory program (OCC bank stablecoin engagement </w:t>
       </w:r>
       <w:hyperlink r:id="rId12">
         <w:r>

</xml_diff>

<commit_message>
site(resume): deploy proof-strip line-break fixes across all six resume builds
Layout-only refresh of the downloadable resume docx and PDFs; text content is
unchanged (verified via whitespace-normalized pdftotext diff per variant).
AI_Governance: header proof strip rebalanced into three even centered lines,
removing the stranded "FSB AI consultation response" widow line. All other
five variants: the patent-pending Canonical-State Architecture item now sits
on its own centered line instead of wrapping mid-phrase (Policy previously
broke right after "Patent-pending"). All six remain exactly 2 pages.
Workflow-clone source commits: 3264580 (AI rebalance), ba10608 (five-variant
patent line).

Co-Authored-By: Claude Fable 5 <noreply@anthropic.com>
</commit_message>
<xml_diff>
--- a/resumes/Zukowski_Resume_AI_Governance_Infrastructure.docx
+++ b/resumes/Zukowski_Resume_AI_Governance_Infrastructure.docx
@@ -119,7 +119,9 @@
           <w:i w:val="0"/>
           <w:sz w:val="18"/>
         </w:rPr>
-        <w:t>· 22 MCP + API connections · ~75 DATs analyzed · Diligence⁠-⁠doc review 4hr to 1hr · 8 SSRN papers · 13 federal comment letters · FSB AI consultation response</w:t>
+        <w:t>· 22 MCP + API connections · ~75 DATs analyzed · Diligence⁠-⁠doc review 4hr to 1hr</w:t>
+        <w:br/>
+        <w:t>· 8 SSRN papers · 13 federal comment letters · FSB AI consultation response</w:t>
         <w:br/>
         <w:t>· Patent⁠-⁠pending Canonical⁠-⁠State Architecture for multi⁠-⁠agent AI research (eight USPTO provisional applications, 2026)</w:t>
       </w:r>

</xml_diff>

<commit_message>
Update patent-pending public count to ten
Lightly update the live site and resume surfaces after the P5 and P6 provisional filings: homepage, research index, resume pages, and resume PDF/DOCX files now cite ten pending USPTO applications with neutral scope language.

Out of scope this cycle: patent packet internals, receipt codification, and detailed mechanism disclosure.

Co-authored-by: Cursor <cursoragent@cursor.com>
</commit_message>
<xml_diff>
--- a/resumes/Zukowski_Resume_AI_Governance_Infrastructure.docx
+++ b/resumes/Zukowski_Resume_AI_Governance_Infrastructure.docx
@@ -16,7 +16,7 @@
           <w:sz w:val="40"/>
           <w:szCs w:val="40"/>
         </w:rPr>
-        <w:t xml:space="preserve">Zach Zukowski</w:t>
+        <w:t>Zach Zukowski</w:t>
       </w:r>
     </w:p>
     <w:p>
@@ -31,7 +31,7 @@
           <w:sz w:val="19"/>
           <w:szCs w:val="19"/>
         </w:rPr>
-        <w:t xml:space="preserve">Orlando, FL | Zach@Tokenization.Systems | 407-536-8625</w:t>
+        <w:t>Orlando, FL | Zach@Tokenization.Systems | 407-536-8625</w:t>
       </w:r>
     </w:p>
     <w:p>
@@ -123,7 +123,7 @@
         <w:br/>
         <w:t>· 8 SSRN papers · 13 federal comment letters · FSB AI consultation response</w:t>
         <w:br/>
-        <w:t>· Patent⁠-⁠pending Canonical⁠-⁠State Architecture for multi⁠-⁠agent AI research (eight USPTO provisional applications, 2026)</w:t>
+        <w:t>· Patent⁠-⁠pending Canonical⁠-⁠State Architecture for multi⁠-⁠agent AI research (ten USPTO provisional applications, 2026)</w:t>
       </w:r>
     </w:p>
     <w:p>
@@ -142,7 +142,7 @@
           <w:sz w:val="20"/>
           <w:szCs w:val="20"/>
         </w:rPr>
-        <w:t xml:space="preserve">SUMMARY</w:t>
+        <w:t>SUMMARY</w:t>
       </w:r>
     </w:p>
     <w:p>
@@ -189,7 +189,7 @@
           <w:sz w:val="20"/>
           <w:szCs w:val="20"/>
         </w:rPr>
-        <w:t xml:space="preserve">EXPERIENCE</w:t>
+        <w:t>EXPERIENCE</w:t>
       </w:r>
     </w:p>
     <w:p>
@@ -613,7 +613,7 @@
           <w:sz w:val="20"/>
           <w:szCs w:val="20"/>
         </w:rPr>
-        <w:t xml:space="preserve">SELECTED RESEARCH</w:t>
+        <w:t>SELECTED RESEARCH</w:t>
       </w:r>
     </w:p>
     <w:p>
@@ -631,7 +631,7 @@
         <w:t>Canonical-State Architecture.</w:t>
       </w:r>
       <w:r>
-        <w:t xml:space="preserve"> Filed eight US provisional patent applications in 2026: a five-element coordination system for concurrent AI-agent sessions on a shared version-controlled repository, integrating per-session staging-index isolation, a multi-mode verification engine, a commit-time canonical-state coherence gate, recursive self-validation of discipline codifications, and an operator-confirmed promotion gate; validated across ~2,170 commits and 4 to 6 parallel AI coding sessions over ~4 months, with a companion 73-page methodology preprint. The applications extend the architecture to role-routed cross-session coordination, actual-touched-file collision detection, and a self-describing verification registry, plus separate applications for evidence-grounding of AI-generated assessments and cited values.</w:t>
+        <w:t xml:space="preserve"> Filed ten US provisional patent applications in 2026: a five-element coordination system for concurrent AI-agent sessions on a shared version-controlled repository, integrating per-session staging-index isolation, a multi-mode verification engine, a commit-time canonical-state coherence gate, recursive self-validation of discipline codifications, and an operator-confirmed promotion gate; validated across ~2,170 commits and 4 to 6 parallel AI coding sessions over ~4 months, with a companion 73-page methodology preprint. The applications extend the architecture to role-routed cross-session coordination, actual-touched-file collision detection, and a self-describing verification registry, plus separate applications for evidence-grounding of AI-generated assessments and cited values.</w:t>
       </w:r>
     </w:p>
     <w:p>
@@ -818,7 +818,7 @@
           <w:sz w:val="20"/>
           <w:szCs w:val="20"/>
         </w:rPr>
-        <w:t xml:space="preserve">TECHNICAL</w:t>
+        <w:t>TECHNICAL</w:t>
       </w:r>
     </w:p>
     <w:p>
@@ -945,7 +945,7 @@
           <w:sz w:val="20"/>
           <w:szCs w:val="20"/>
         </w:rPr>
-        <w:t xml:space="preserve">EDUCATION</w:t>
+        <w:t>EDUCATION</w:t>
       </w:r>
     </w:p>
     <w:p>

</xml_diff>

<commit_message>
Update patent-pending public count to eleven (App 64/107,827 filed 2026-07-08)
Eleventh USPTO provisional filed 11:14 PM ET 2026-07-08 (receipt-verified).
index.html meta + JSON-LD + hero chip + about-card (adds authorship-based
commit-replay narrowing with edit-intent ledger collision gating, 64/107,827),
research/index.html, seven resume pages, and the six role-resume DOCX/PDF
binaries (surgical docx edits; all six verified 2 pages; parity PASS).
</commit_message>
<xml_diff>
--- a/resumes/Zukowski_Resume_AI_Governance_Infrastructure.docx
+++ b/resumes/Zukowski_Resume_AI_Governance_Infrastructure.docx
@@ -123,7 +123,7 @@
         <w:br/>
         <w:t>· 8 SSRN papers · 13 federal comment letters · FSB AI consultation response</w:t>
         <w:br/>
-        <w:t>· Patent⁠-⁠pending Canonical⁠-⁠State Architecture for multi⁠-⁠agent AI research (ten USPTO provisional applications, 2026)</w:t>
+        <w:t>· Patent⁠-⁠pending Canonical⁠-⁠State Architecture for multi⁠-⁠agent AI research (eleven USPTO provisional applications, 2026)</w:t>
       </w:r>
     </w:p>
     <w:p>
@@ -631,7 +631,7 @@
         <w:t>Canonical-State Architecture.</w:t>
       </w:r>
       <w:r>
-        <w:t xml:space="preserve"> Filed ten US provisional patent applications in 2026: a five-element coordination system for concurrent AI-agent sessions on a shared version-controlled repository, integrating per-session staging-index isolation, a multi-mode verification engine, a commit-time canonical-state coherence gate, recursive self-validation of discipline codifications, and an operator-confirmed promotion gate; validated across ~2,170 commits and 4 to 6 parallel AI coding sessions over ~4 months, with a companion 73-page methodology preprint. The applications extend the architecture to role-routed cross-session coordination, actual-touched-file collision detection, and a self-describing verification registry, plus separate applications for evidence-grounding of AI-generated assessments and cited values.</w:t>
+        <w:t xml:space="preserve"> Filed eleven US provisional patent applications in 2026: a five-element coordination system for concurrent AI-agent sessions on a shared version-controlled repository, integrating per-session staging-index isolation, a multi-mode verification engine, a commit-time canonical-state coherence gate, recursive self-validation of discipline codifications, and an operator-confirmed promotion gate; validated across ~7,900 commits and 16 or more parallel AI coding sessions over ~4 months, with a companion 73-page methodology preprint. The applications extend the architecture to role-routed cross-session coordination, actual-touched-file collision detection, and a self-describing verification registry, plus separate applications for evidence-grounding of AI-generated assessments and cited values.</w:t>
       </w:r>
     </w:p>
     <w:p>

</xml_diff>

<commit_message>
Update patent-pending public count to twelve (App 64/109,514 filed 2026-07-10)
Twelfth USPTO provisional filed 11:57 PM ET 2026-07-10 (receipt-verified;
Confirmation #1220; grounded against FILING_ACKNOWLEDGMENT.md and the
acknowledgement receipt PDF re-read this session). index.html meta + JSON-LD +
hero chip + about-card (adds pre-commit write-collision detection and
classification among concurrent agent sessions sharing a version-control
repository, 64/109,514), research/index.html, seven resume pages, and the six
role-resume DOCX/PDF binaries (surgical docx edits preserving the fitted
2-page typography; all six verified 2 pages; check_home_stats and
check_letter_count PASS). P5/P6 posture untouched per DEC-236/DEC-237.
Dispatch: site_propagate_a1supp_64109514_2026-07-11 (author GO 2026-07-11).
</commit_message>
<xml_diff>
--- a/resumes/Zukowski_Resume_AI_Governance_Infrastructure.docx
+++ b/resumes/Zukowski_Resume_AI_Governance_Infrastructure.docx
@@ -123,7 +123,7 @@
         <w:br/>
         <w:t>· 8 SSRN papers · 13 federal comment letters · FSB AI consultation response</w:t>
         <w:br/>
-        <w:t>· Patent⁠-⁠pending Canonical⁠-⁠State Architecture for multi⁠-⁠agent AI research (eleven USPTO provisional applications, 2026)</w:t>
+        <w:t>· Patent⁠-⁠pending Canonical⁠-⁠State Architecture for multi⁠-⁠agent AI research (twelve USPTO provisional applications, 2026)</w:t>
       </w:r>
     </w:p>
     <w:p>
@@ -631,7 +631,7 @@
         <w:t>Canonical-State Architecture.</w:t>
       </w:r>
       <w:r>
-        <w:t xml:space="preserve"> Filed eleven US provisional patent applications in 2026: a five-element coordination system for concurrent AI-agent sessions on a shared version-controlled repository, integrating per-session staging-index isolation, a multi-mode verification engine, a commit-time canonical-state coherence gate, recursive self-validation of discipline codifications, and an operator-confirmed promotion gate; validated across ~7,900 commits and 16 or more parallel AI coding sessions over ~4 months, with a companion 73-page methodology preprint. The applications extend the architecture to role-routed cross-session coordination, actual-touched-file collision detection, and a self-describing verification registry, plus separate applications for evidence-grounding of AI-generated assessments and cited values.</w:t>
+        <w:t xml:space="preserve"> Filed twelve US provisional patent applications in 2026: a five-element coordination system for concurrent AI-agent sessions on a shared version-controlled repository, integrating per-session staging-index isolation, a multi-mode verification engine, a commit-time canonical-state coherence gate, recursive self-validation of discipline codifications, and an operator-confirmed promotion gate; validated across ~7,900 commits and 16 or more parallel AI coding sessions over ~4 months, with a companion 73-page methodology preprint. The applications extend the architecture to role-routed cross-session coordination, actual-touched-file collision detection, and a self-describing verification registry, plus separate applications for evidence-grounding of AI-generated assessments and cited values.</w:t>
       </w:r>
     </w:p>
     <w:p>

</xml_diff>

<commit_message>
Refresh AI Governance Infrastructure resume: current platform figures and mNAV pipeline detail
Re-rendered from the canonical spec: the Canonical-State Architecture item now reads
~9,600 commits and 16 or more parallel AI coding sessions (as of 2026-07-15), and the
SEC-filing and press-release monitoring bullet names the pipeline (n8n + Apify; 30+ DAT
tickers; coins held, cash, debt, share counts at float, adjusted, and fully diluted;
multiple on NAV computed apples to apples across the sector). Resume page prose updated
from the stale ~2,170 commits / 4 to 6 sessions line to the same re-measured figures.
Render-parity gate re-run across all six variants: PASS.

Co-Authored-By: Claude Fable 5 <noreply@anthropic.com>
</commit_message>
<xml_diff>
--- a/resumes/Zukowski_Resume_AI_Governance_Infrastructure.docx
+++ b/resumes/Zukowski_Resume_AI_Governance_Infrastructure.docx
@@ -16,7 +16,7 @@
           <w:sz w:val="40"/>
           <w:szCs w:val="40"/>
         </w:rPr>
-        <w:t>Zach Zukowski</w:t>
+        <w:t xml:space="preserve">Zach Zukowski</w:t>
       </w:r>
     </w:p>
     <w:p>
@@ -31,7 +31,7 @@
           <w:sz w:val="19"/>
           <w:szCs w:val="19"/>
         </w:rPr>
-        <w:t>Orlando, FL | Zach@Tokenization.Systems | 407-536-8625</w:t>
+        <w:t xml:space="preserve">Orlando, FL | Zach@Tokenization.Systems | 407-536-8625</w:t>
       </w:r>
     </w:p>
     <w:p>
@@ -142,7 +142,7 @@
           <w:sz w:val="20"/>
           <w:szCs w:val="20"/>
         </w:rPr>
-        <w:t>SUMMARY</w:t>
+        <w:t xml:space="preserve">SUMMARY</w:t>
       </w:r>
     </w:p>
     <w:p>
@@ -189,7 +189,7 @@
           <w:sz w:val="20"/>
           <w:szCs w:val="20"/>
         </w:rPr>
-        <w:t>EXPERIENCE</w:t>
+        <w:t xml:space="preserve">EXPERIENCE</w:t>
       </w:r>
     </w:p>
     <w:p>
@@ -469,7 +469,7 @@
         <w:ind w:left="320" w:hanging="160"/>
       </w:pPr>
       <w:r>
-        <w:t>• Built automated SEC-filing and press-release monitoring for Digital Asset Treasury Stocks (DATs); analyzed ~75 tokenization offerings in 2025 and invested in 18; AI-assisted diligence workflows reducing subscription-document review from ~4 hours to ~1 hour per deal.</w:t>
+        <w:t>• Built an automated SEC-filing and press-release monitoring pipeline (n8n + Apify) covering 30+ Digital Asset Treasury Stocks (DATs), tracking coins held, cash, debt, and share counts (float, adjusted, fully diluted) per issuer to compute multiple on NAV (mNAV) apples to apples across the sector; analyzed ~75 tokenization offerings in 2025 and invested in 18; AI-assisted diligence workflows reducing subscription-document review from ~4 hours to ~1 hour per deal.</w:t>
       </w:r>
     </w:p>
     <w:p>
@@ -613,7 +613,7 @@
           <w:sz w:val="20"/>
           <w:szCs w:val="20"/>
         </w:rPr>
-        <w:t>SELECTED RESEARCH</w:t>
+        <w:t xml:space="preserve">SELECTED RESEARCH</w:t>
       </w:r>
     </w:p>
     <w:p>
@@ -631,7 +631,7 @@
         <w:t>Canonical-State Architecture.</w:t>
       </w:r>
       <w:r>
-        <w:t xml:space="preserve"> Filed twelve US provisional patent applications in 2026: a five-element coordination system for concurrent AI-agent sessions on a shared version-controlled repository, integrating per-session staging-index isolation, a multi-mode verification engine, a commit-time canonical-state coherence gate, recursive self-validation of discipline codifications, and an operator-confirmed promotion gate; validated across ~7,900 commits and 16 or more parallel AI coding sessions over ~4 months, with a companion 73-page methodology preprint. The applications extend the architecture to role-routed cross-session coordination, actual-touched-file collision detection, and a self-describing verification registry, plus separate applications for evidence-grounding of AI-generated assessments and cited values.</w:t>
+        <w:t xml:space="preserve"> Filed twelve US provisional patent applications in 2026: a five-element coordination system for concurrent AI-agent sessions on a shared version-controlled repository, integrating per-session staging-index isolation, a multi-mode verification engine, a commit-time canonical-state coherence gate, recursive self-validation of discipline codifications, and an operator-confirmed promotion gate; validated across ~9,600 commits and 16 or more parallel AI coding sessions over ~4 months (as of 2026-07-15), with a companion 73-page methodology preprint. The applications extend the architecture to role-routed cross-session coordination, actual-touched-file collision detection, and a self-describing verification registry, plus separate applications for evidence-grounding of AI-generated assessments and cited values.</w:t>
       </w:r>
     </w:p>
     <w:p>
@@ -818,7 +818,7 @@
           <w:sz w:val="20"/>
           <w:szCs w:val="20"/>
         </w:rPr>
-        <w:t>TECHNICAL</w:t>
+        <w:t xml:space="preserve">TECHNICAL</w:t>
       </w:r>
     </w:p>
     <w:p>
@@ -945,7 +945,7 @@
           <w:sz w:val="20"/>
           <w:szCs w:val="20"/>
         </w:rPr>
-        <w:t>EDUCATION</w:t>
+        <w:t xml:space="preserve">EDUCATION</w:t>
       </w:r>
     </w:p>
     <w:p>

</xml_diff>

<commit_message>
Refresh AI Governance Infrastructure resume counts: fourteen federal comment letters, sixteen USPTO provisional applications
Re-rendered from the canonical spec; render-parity gate PASS across all six variants.
The fourteen federal letters match the deployed letters/ set (fifteen filings including
the international FSB AI consultation response).

Co-Authored-By: Claude Fable 5 <noreply@anthropic.com>
</commit_message>
<xml_diff>
--- a/resumes/Zukowski_Resume_AI_Governance_Infrastructure.docx
+++ b/resumes/Zukowski_Resume_AI_Governance_Infrastructure.docx
@@ -121,9 +121,9 @@
         </w:rPr>
         <w:t>· 22 MCP + API connections · ~75 DATs analyzed · Diligence⁠-⁠doc review 4hr to 1hr</w:t>
         <w:br/>
-        <w:t>· 8 SSRN papers · 13 federal comment letters · FSB AI consultation response</w:t>
+        <w:t>· 8 SSRN papers · 14 federal comment letters · FSB AI consultation response</w:t>
         <w:br/>
-        <w:t>· Patent⁠-⁠pending Canonical⁠-⁠State Architecture for multi⁠-⁠agent AI research (twelve USPTO provisional applications, 2026)</w:t>
+        <w:t>· Patent⁠-⁠pending Canonical⁠-⁠State Architecture for multi⁠-⁠agent AI research (sixteen USPTO provisional applications, 2026)</w:t>
       </w:r>
     </w:p>
     <w:p>
@@ -288,7 +288,7 @@
         <w:ind w:left="320" w:hanging="160"/>
       </w:pPr>
       <w:r>
-        <w:t xml:space="preserve">• Contributed thirteen comment letters across a federal regulatory program (OCC bank stablecoin engagement </w:t>
+        <w:t xml:space="preserve">• Contributed fourteen comment letters across a federal regulatory program (OCC bank stablecoin engagement </w:t>
       </w:r>
       <w:hyperlink r:id="rId12">
         <w:r>
@@ -631,7 +631,7 @@
         <w:t>Canonical-State Architecture.</w:t>
       </w:r>
       <w:r>
-        <w:t xml:space="preserve"> Filed twelve US provisional patent applications in 2026: a five-element coordination system for concurrent AI-agent sessions on a shared version-controlled repository, integrating per-session staging-index isolation, a multi-mode verification engine, a commit-time canonical-state coherence gate, recursive self-validation of discipline codifications, and an operator-confirmed promotion gate; validated across ~9,600 commits and 16 or more parallel AI coding sessions over ~4 months (as of 2026-07-15), with a companion 73-page methodology preprint. The applications extend the architecture to role-routed cross-session coordination, actual-touched-file collision detection, and a self-describing verification registry, plus separate applications for evidence-grounding of AI-generated assessments and cited values.</w:t>
+        <w:t xml:space="preserve"> Filed sixteen US provisional patent applications in 2026: a five-element coordination system for concurrent AI-agent sessions on a shared version-controlled repository, integrating per-session staging-index isolation, a multi-mode verification engine, a commit-time canonical-state coherence gate, recursive self-validation of discipline codifications, and an operator-confirmed promotion gate; validated across ~9,600 commits and 16 or more parallel AI coding sessions over ~4 months (as of 2026-07-15), with a companion 73-page methodology preprint. The applications extend the architecture to role-routed cross-session coordination, actual-touched-file collision detection, and a self-describing verification registry, plus separate applications for evidence-grounding of AI-generated assessments and cited values.</w:t>
       </w:r>
     </w:p>
     <w:p>

</xml_diff>

<commit_message>
content(resumes): B1 stats corrected to paper of record across all six; AI proof strip drops the DATs chip
All six DOCX and PDF rebuilt from the spec pipeline (2-page fit; parity PASS). Word-level diff vs the prior shipped set verified confined to the deliberate updates: '240-scenario Monte Carlo simulation' to '806-run agent-based simulation battery' (all six variants), 'supply volatility' to 'node-count variance' (AI Governance), and the '~75 DATs analyzed' chip removed from the AI Governance proof strip (author directive 2026-07-18). Letters count fourteen unchanged (already current on the shipped set). Source-of-truth edits live in the workflow repo (resume_spec.py; workflow commits 87061cccd and 2266323a5).

Co-Authored-By: Claude Fable 5 <noreply@anthropic.com>
</commit_message>
<xml_diff>
--- a/resumes/Zukowski_Resume_AI_Governance_Infrastructure.docx
+++ b/resumes/Zukowski_Resume_AI_Governance_Infrastructure.docx
@@ -119,7 +119,7 @@
           <w:i w:val="0"/>
           <w:sz w:val="18"/>
         </w:rPr>
-        <w:t>· 22 MCP + API connections · ~75 DATs analyzed · Diligence⁠-⁠doc review 4hr to 1hr</w:t>
+        <w:t>· 22 MCP + API connections · Diligence⁠-⁠doc review 4hr to 1hr</w:t>
         <w:br/>
         <w:t>· 8 SSRN papers · 14 federal comment letters · FSB AI consultation response</w:t>
         <w:br/>
@@ -694,7 +694,7 @@
         </w:r>
       </w:hyperlink>
       <w:r>
-        <w:t xml:space="preserve"> Industrial control engineering (PID controller) applied to token-supply emission as programmable monetary-policy mechanism; 240-scenario Monte Carlo simulation; cuts worst-case supply volatility ~6x under competitor-shock attack.</w:t>
+        <w:t xml:space="preserve"> Industrial control engineering (PID controller) applied to token-supply emission as programmable monetary-policy mechanism; 806-run agent-based simulation battery; cuts worst-case node-count variance ~6x under competitor-shock attack.</w:t>
       </w:r>
     </w:p>
     <w:p>

</xml_diff>